<commit_message>
docs(G1-07): align risk register layout with template
</commit_message>
<xml_diff>
--- a/docs/deliverables/04-风险登记册v1.docx
+++ b/docs/deliverables/04-风险登记册v1.docx
@@ -189,17 +189,17 @@
     </w:p>
     <w:tbl>
       <w:tblPr>
-        <w:tblW w:type="dxa" w:w="7286"/>
+        <w:tblW w:type="dxa" w:w="9009"/>
         <w:tblLayout w:type="fixed"/>
         <w:tblLook w:firstColumn="1" w:firstRow="1" w:lastColumn="0" w:lastRow="0" w:noHBand="0" w:noVBand="1" w:val="04A0"/>
         <w:tblInd w:type="dxa" w:w="120"/>
       </w:tblPr>
       <w:tblGrid>
-        <w:gridCol w:w="709"/>
-        <w:gridCol w:w="907"/>
-        <w:gridCol w:w="822"/>
-        <w:gridCol w:w="3969"/>
-        <w:gridCol w:w="879"/>
+        <w:gridCol w:w="1514"/>
+        <w:gridCol w:w="1531"/>
+        <w:gridCol w:w="1480"/>
+        <w:gridCol w:w="3010"/>
+        <w:gridCol w:w="1474"/>
       </w:tblGrid>
       <w:tr>
         <w:trPr>
@@ -207,9 +207,9 @@
         </w:trPr>
         <w:tc>
           <w:tcPr>
-            <w:tcW w:type="dxa" w:w="709"/>
-            <w:vAlign w:val="center"/>
-            <w:shd w:fill="17365D"/>
+            <w:tcW w:type="dxa" w:w="1514"/>
+            <w:vAlign w:val="center"/>
+            <w:shd w:fill="D9E2EC"/>
             <w:tcBorders>
               <w:top w:val="single" w:sz="6" w:color="D9D9D9"/>
               <w:left w:val="single" w:sz="6" w:color="D9D9D9"/>
@@ -229,7 +229,7 @@
               <w:rPr>
                 <w:rFonts w:ascii="宋体" w:hAnsi="宋体" w:eastAsia="宋体"/>
                 <w:b/>
-                <w:color w:val="FFFFFF"/>
+                <w:color w:val="000000"/>
                 <w:sz w:val="17"/>
               </w:rPr>
               <w:t>版本</w:t>
@@ -238,9 +238,9 @@
         </w:tc>
         <w:tc>
           <w:tcPr>
-            <w:tcW w:type="dxa" w:w="907"/>
-            <w:vAlign w:val="center"/>
-            <w:shd w:fill="17365D"/>
+            <w:tcW w:type="dxa" w:w="1531"/>
+            <w:vAlign w:val="center"/>
+            <w:shd w:fill="D9E2EC"/>
             <w:tcBorders>
               <w:top w:val="single" w:sz="6" w:color="D9D9D9"/>
               <w:left w:val="single" w:sz="6" w:color="D9D9D9"/>
@@ -260,7 +260,7 @@
               <w:rPr>
                 <w:rFonts w:ascii="宋体" w:hAnsi="宋体" w:eastAsia="宋体"/>
                 <w:b/>
-                <w:color w:val="FFFFFF"/>
+                <w:color w:val="000000"/>
                 <w:sz w:val="17"/>
               </w:rPr>
               <w:t>日期</w:t>
@@ -269,9 +269,9 @@
         </w:tc>
         <w:tc>
           <w:tcPr>
-            <w:tcW w:type="dxa" w:w="822"/>
-            <w:vAlign w:val="center"/>
-            <w:shd w:fill="17365D"/>
+            <w:tcW w:type="dxa" w:w="1480"/>
+            <w:vAlign w:val="center"/>
+            <w:shd w:fill="D9E2EC"/>
             <w:tcBorders>
               <w:top w:val="single" w:sz="6" w:color="D9D9D9"/>
               <w:left w:val="single" w:sz="6" w:color="D9D9D9"/>
@@ -291,7 +291,7 @@
               <w:rPr>
                 <w:rFonts w:ascii="宋体" w:hAnsi="宋体" w:eastAsia="宋体"/>
                 <w:b/>
-                <w:color w:val="FFFFFF"/>
+                <w:color w:val="000000"/>
                 <w:sz w:val="17"/>
               </w:rPr>
               <w:t>修订章节</w:t>
@@ -300,9 +300,9 @@
         </w:tc>
         <w:tc>
           <w:tcPr>
-            <w:tcW w:type="dxa" w:w="3969"/>
-            <w:vAlign w:val="center"/>
-            <w:shd w:fill="17365D"/>
+            <w:tcW w:type="dxa" w:w="3010"/>
+            <w:vAlign w:val="center"/>
+            <w:shd w:fill="D9E2EC"/>
             <w:tcBorders>
               <w:top w:val="single" w:sz="6" w:color="D9D9D9"/>
               <w:left w:val="single" w:sz="6" w:color="D9D9D9"/>
@@ -322,7 +322,7 @@
               <w:rPr>
                 <w:rFonts w:ascii="宋体" w:hAnsi="宋体" w:eastAsia="宋体"/>
                 <w:b/>
-                <w:color w:val="FFFFFF"/>
+                <w:color w:val="000000"/>
                 <w:sz w:val="17"/>
               </w:rPr>
               <w:t>修订说明</w:t>
@@ -331,9 +331,9 @@
         </w:tc>
         <w:tc>
           <w:tcPr>
-            <w:tcW w:type="dxa" w:w="879"/>
-            <w:vAlign w:val="center"/>
-            <w:shd w:fill="17365D"/>
+            <w:tcW w:type="dxa" w:w="1474"/>
+            <w:vAlign w:val="center"/>
+            <w:shd w:fill="D9E2EC"/>
             <w:tcBorders>
               <w:top w:val="single" w:sz="6" w:color="D9D9D9"/>
               <w:left w:val="single" w:sz="6" w:color="D9D9D9"/>
@@ -353,7 +353,7 @@
               <w:rPr>
                 <w:rFonts w:ascii="宋体" w:hAnsi="宋体" w:eastAsia="宋体"/>
                 <w:b/>
-                <w:color w:val="FFFFFF"/>
+                <w:color w:val="000000"/>
                 <w:sz w:val="17"/>
               </w:rPr>
               <w:t>编制/修订人</w:t>
@@ -364,7 +364,7 @@
       <w:tr>
         <w:tc>
           <w:tcPr>
-            <w:tcW w:type="dxa" w:w="709"/>
+            <w:tcW w:type="dxa" w:w="1514"/>
             <w:vAlign w:val="center"/>
             <w:tcBorders>
               <w:top w:val="single" w:sz="6" w:color="D9D9D9"/>
@@ -394,7 +394,7 @@
         </w:tc>
         <w:tc>
           <w:tcPr>
-            <w:tcW w:type="dxa" w:w="907"/>
+            <w:tcW w:type="dxa" w:w="1531"/>
             <w:vAlign w:val="center"/>
             <w:tcBorders>
               <w:top w:val="single" w:sz="6" w:color="D9D9D9"/>
@@ -424,7 +424,7 @@
         </w:tc>
         <w:tc>
           <w:tcPr>
-            <w:tcW w:type="dxa" w:w="822"/>
+            <w:tcW w:type="dxa" w:w="1480"/>
             <w:vAlign w:val="center"/>
             <w:tcBorders>
               <w:top w:val="single" w:sz="6" w:color="D9D9D9"/>
@@ -454,7 +454,7 @@
         </w:tc>
         <w:tc>
           <w:tcPr>
-            <w:tcW w:type="dxa" w:w="3969"/>
+            <w:tcW w:type="dxa" w:w="3010"/>
             <w:vAlign w:val="center"/>
             <w:tcBorders>
               <w:top w:val="single" w:sz="6" w:color="D9D9D9"/>
@@ -484,7 +484,7 @@
         </w:tc>
         <w:tc>
           <w:tcPr>
-            <w:tcW w:type="dxa" w:w="879"/>
+            <w:tcW w:type="dxa" w:w="1474"/>
             <w:vAlign w:val="center"/>
             <w:tcBorders>
               <w:top w:val="single" w:sz="6" w:color="D9D9D9"/>
@@ -514,6 +514,11 @@
         </w:tc>
       </w:tr>
     </w:tbl>
+    <w:p>
+      <w:r>
+        <w:br w:type="page"/>
+      </w:r>
+    </w:p>
     <w:p>
       <w:pPr>
         <w:pStyle w:val="1"/>
@@ -565,7 +570,7 @@
       <w:r>
         <w:drawing>
           <wp:inline xmlns:a="http://schemas.openxmlformats.org/drawingml/2006/main" xmlns:pic="http://schemas.openxmlformats.org/drawingml/2006/picture">
-            <wp:extent cx="5029200" cy="2828925"/>
+            <wp:extent cx="4855464" cy="3630168"/>
             <wp:docPr id="1" name="图1-1 项目风险矩阵" title="图1-1 项目风险矩阵" descr="图1-1 项目风险矩阵"/>
             <wp:cNvGraphicFramePr>
               <a:graphicFrameLocks noChangeAspect="1"/>
@@ -574,7 +579,7 @@
               <a:graphicData uri="http://schemas.openxmlformats.org/drawingml/2006/picture">
                 <pic:pic>
                   <pic:nvPicPr>
-                    <pic:cNvPr id="0" name="risk-matrix.png"/>
+                    <pic:cNvPr id="0" name="risk-matrix-4x3.png"/>
                     <pic:cNvPicPr/>
                   </pic:nvPicPr>
                   <pic:blipFill>
@@ -586,7 +591,7 @@
                   <pic:spPr>
                     <a:xfrm>
                       <a:off x="0" y="0"/>
-                      <a:ext cx="5029200" cy="2828925"/>
+                      <a:ext cx="4855464" cy="3630168"/>
                     </a:xfrm>
                     <a:prstGeom prst="rect"/>
                   </pic:spPr>
@@ -631,21 +636,21 @@
     </w:p>
     <w:tbl>
       <w:tblPr>
-        <w:tblW w:type="dxa" w:w="5702"/>
+        <w:tblW w:type="dxa" w:w="9026"/>
         <w:tblLayout w:type="fixed"/>
         <w:tblLook w:firstColumn="1" w:firstRow="1" w:lastColumn="0" w:lastRow="0" w:noHBand="0" w:noVBand="1" w:val="04A0"/>
         <w:tblInd w:type="dxa" w:w="120"/>
       </w:tblPr>
       <w:tblGrid>
-        <w:gridCol w:w="408"/>
-        <w:gridCol w:w="1162"/>
-        <w:gridCol w:w="425"/>
-        <w:gridCol w:w="351"/>
-        <w:gridCol w:w="351"/>
-        <w:gridCol w:w="499"/>
-        <w:gridCol w:w="1559"/>
-        <w:gridCol w:w="408"/>
-        <w:gridCol w:w="539"/>
+        <w:gridCol w:w="669"/>
+        <w:gridCol w:w="2228"/>
+        <w:gridCol w:w="765"/>
+        <w:gridCol w:w="590"/>
+        <w:gridCol w:w="590"/>
+        <w:gridCol w:w="658"/>
+        <w:gridCol w:w="2103"/>
+        <w:gridCol w:w="765"/>
+        <w:gridCol w:w="658"/>
       </w:tblGrid>
       <w:tr>
         <w:trPr>
@@ -653,9 +658,9 @@
         </w:trPr>
         <w:tc>
           <w:tcPr>
-            <w:tcW w:type="dxa" w:w="408"/>
-            <w:vAlign w:val="center"/>
-            <w:shd w:fill="17365D"/>
+            <w:tcW w:type="dxa" w:w="669"/>
+            <w:vAlign w:val="center"/>
+            <w:shd w:fill="DCE6F1"/>
             <w:tcBorders>
               <w:top w:val="single" w:sz="6" w:color="D9D9D9"/>
               <w:left w:val="single" w:sz="6" w:color="D9D9D9"/>
@@ -675,7 +680,7 @@
               <w:rPr>
                 <w:rFonts w:ascii="宋体" w:hAnsi="宋体" w:eastAsia="宋体"/>
                 <w:b/>
-                <w:color w:val="FFFFFF"/>
+                <w:color w:val="000000"/>
                 <w:sz w:val="14"/>
               </w:rPr>
               <w:t>编号</w:t>
@@ -684,9 +689,9 @@
         </w:tc>
         <w:tc>
           <w:tcPr>
-            <w:tcW w:type="dxa" w:w="1162"/>
-            <w:vAlign w:val="center"/>
-            <w:shd w:fill="17365D"/>
+            <w:tcW w:type="dxa" w:w="2228"/>
+            <w:vAlign w:val="center"/>
+            <w:shd w:fill="DCE6F1"/>
             <w:tcBorders>
               <w:top w:val="single" w:sz="6" w:color="D9D9D9"/>
               <w:left w:val="single" w:sz="6" w:color="D9D9D9"/>
@@ -706,7 +711,7 @@
               <w:rPr>
                 <w:rFonts w:ascii="宋体" w:hAnsi="宋体" w:eastAsia="宋体"/>
                 <w:b/>
-                <w:color w:val="FFFFFF"/>
+                <w:color w:val="000000"/>
                 <w:sz w:val="14"/>
               </w:rPr>
               <w:t>风险描述</w:t>
@@ -715,9 +720,9 @@
         </w:tc>
         <w:tc>
           <w:tcPr>
-            <w:tcW w:type="dxa" w:w="425"/>
-            <w:vAlign w:val="center"/>
-            <w:shd w:fill="17365D"/>
+            <w:tcW w:type="dxa" w:w="765"/>
+            <w:vAlign w:val="center"/>
+            <w:shd w:fill="DCE6F1"/>
             <w:tcBorders>
               <w:top w:val="single" w:sz="6" w:color="D9D9D9"/>
               <w:left w:val="single" w:sz="6" w:color="D9D9D9"/>
@@ -737,7 +742,7 @@
               <w:rPr>
                 <w:rFonts w:ascii="宋体" w:hAnsi="宋体" w:eastAsia="宋体"/>
                 <w:b/>
-                <w:color w:val="FFFFFF"/>
+                <w:color w:val="000000"/>
                 <w:sz w:val="14"/>
               </w:rPr>
               <w:t>类别</w:t>
@@ -746,9 +751,9 @@
         </w:tc>
         <w:tc>
           <w:tcPr>
-            <w:tcW w:type="dxa" w:w="351"/>
-            <w:vAlign w:val="center"/>
-            <w:shd w:fill="17365D"/>
+            <w:tcW w:type="dxa" w:w="590"/>
+            <w:vAlign w:val="center"/>
+            <w:shd w:fill="DCE6F1"/>
             <w:tcBorders>
               <w:top w:val="single" w:sz="6" w:color="D9D9D9"/>
               <w:left w:val="single" w:sz="6" w:color="D9D9D9"/>
@@ -768,7 +773,7 @@
               <w:rPr>
                 <w:rFonts w:ascii="宋体" w:hAnsi="宋体" w:eastAsia="宋体"/>
                 <w:b/>
-                <w:color w:val="FFFFFF"/>
+                <w:color w:val="000000"/>
                 <w:sz w:val="14"/>
               </w:rPr>
               <w:t>概率</w:t>
@@ -777,9 +782,9 @@
         </w:tc>
         <w:tc>
           <w:tcPr>
-            <w:tcW w:type="dxa" w:w="351"/>
-            <w:vAlign w:val="center"/>
-            <w:shd w:fill="17365D"/>
+            <w:tcW w:type="dxa" w:w="590"/>
+            <w:vAlign w:val="center"/>
+            <w:shd w:fill="DCE6F1"/>
             <w:tcBorders>
               <w:top w:val="single" w:sz="6" w:color="D9D9D9"/>
               <w:left w:val="single" w:sz="6" w:color="D9D9D9"/>
@@ -799,7 +804,7 @@
               <w:rPr>
                 <w:rFonts w:ascii="宋体" w:hAnsi="宋体" w:eastAsia="宋体"/>
                 <w:b/>
-                <w:color w:val="FFFFFF"/>
+                <w:color w:val="000000"/>
                 <w:sz w:val="14"/>
               </w:rPr>
               <w:t>影响</w:t>
@@ -808,9 +813,9 @@
         </w:tc>
         <w:tc>
           <w:tcPr>
-            <w:tcW w:type="dxa" w:w="499"/>
-            <w:vAlign w:val="center"/>
-            <w:shd w:fill="17365D"/>
+            <w:tcW w:type="dxa" w:w="658"/>
+            <w:vAlign w:val="center"/>
+            <w:shd w:fill="DCE6F1"/>
             <w:tcBorders>
               <w:top w:val="single" w:sz="6" w:color="D9D9D9"/>
               <w:left w:val="single" w:sz="6" w:color="D9D9D9"/>
@@ -830,7 +835,7 @@
               <w:rPr>
                 <w:rFonts w:ascii="宋体" w:hAnsi="宋体" w:eastAsia="宋体"/>
                 <w:b/>
-                <w:color w:val="FFFFFF"/>
+                <w:color w:val="000000"/>
                 <w:sz w:val="14"/>
               </w:rPr>
               <w:t>等级</w:t>
@@ -839,9 +844,9 @@
         </w:tc>
         <w:tc>
           <w:tcPr>
-            <w:tcW w:type="dxa" w:w="1559"/>
-            <w:vAlign w:val="center"/>
-            <w:shd w:fill="17365D"/>
+            <w:tcW w:type="dxa" w:w="2103"/>
+            <w:vAlign w:val="center"/>
+            <w:shd w:fill="DCE6F1"/>
             <w:tcBorders>
               <w:top w:val="single" w:sz="6" w:color="D9D9D9"/>
               <w:left w:val="single" w:sz="6" w:color="D9D9D9"/>
@@ -861,7 +866,7 @@
               <w:rPr>
                 <w:rFonts w:ascii="宋体" w:hAnsi="宋体" w:eastAsia="宋体"/>
                 <w:b/>
-                <w:color w:val="FFFFFF"/>
+                <w:color w:val="000000"/>
                 <w:sz w:val="14"/>
               </w:rPr>
               <w:t>应对措施</w:t>
@@ -870,9 +875,9 @@
         </w:tc>
         <w:tc>
           <w:tcPr>
-            <w:tcW w:type="dxa" w:w="408"/>
-            <w:vAlign w:val="center"/>
-            <w:shd w:fill="17365D"/>
+            <w:tcW w:type="dxa" w:w="765"/>
+            <w:vAlign w:val="center"/>
+            <w:shd w:fill="DCE6F1"/>
             <w:tcBorders>
               <w:top w:val="single" w:sz="6" w:color="D9D9D9"/>
               <w:left w:val="single" w:sz="6" w:color="D9D9D9"/>
@@ -892,7 +897,7 @@
               <w:rPr>
                 <w:rFonts w:ascii="宋体" w:hAnsi="宋体" w:eastAsia="宋体"/>
                 <w:b/>
-                <w:color w:val="FFFFFF"/>
+                <w:color w:val="000000"/>
                 <w:sz w:val="14"/>
               </w:rPr>
               <w:t>责任人</w:t>
@@ -901,9 +906,9 @@
         </w:tc>
         <w:tc>
           <w:tcPr>
-            <w:tcW w:type="dxa" w:w="539"/>
-            <w:vAlign w:val="center"/>
-            <w:shd w:fill="17365D"/>
+            <w:tcW w:type="dxa" w:w="658"/>
+            <w:vAlign w:val="center"/>
+            <w:shd w:fill="DCE6F1"/>
             <w:tcBorders>
               <w:top w:val="single" w:sz="6" w:color="D9D9D9"/>
               <w:left w:val="single" w:sz="6" w:color="D9D9D9"/>
@@ -923,7 +928,7 @@
               <w:rPr>
                 <w:rFonts w:ascii="宋体" w:hAnsi="宋体" w:eastAsia="宋体"/>
                 <w:b/>
-                <w:color w:val="FFFFFF"/>
+                <w:color w:val="000000"/>
                 <w:sz w:val="14"/>
               </w:rPr>
               <w:t>状态</w:t>
@@ -934,7 +939,7 @@
       <w:tr>
         <w:tc>
           <w:tcPr>
-            <w:tcW w:type="dxa" w:w="408"/>
+            <w:tcW w:type="dxa" w:w="669"/>
             <w:vAlign w:val="center"/>
             <w:tcBorders>
               <w:top w:val="single" w:sz="6" w:color="D9D9D9"/>
@@ -964,7 +969,7 @@
         </w:tc>
         <w:tc>
           <w:tcPr>
-            <w:tcW w:type="dxa" w:w="1162"/>
+            <w:tcW w:type="dxa" w:w="2228"/>
             <w:vAlign w:val="center"/>
             <w:tcBorders>
               <w:top w:val="single" w:sz="6" w:color="D9D9D9"/>
@@ -994,7 +999,7 @@
         </w:tc>
         <w:tc>
           <w:tcPr>
-            <w:tcW w:type="dxa" w:w="425"/>
+            <w:tcW w:type="dxa" w:w="765"/>
             <w:vAlign w:val="center"/>
             <w:tcBorders>
               <w:top w:val="single" w:sz="6" w:color="D9D9D9"/>
@@ -1024,7 +1029,7 @@
         </w:tc>
         <w:tc>
           <w:tcPr>
-            <w:tcW w:type="dxa" w:w="351"/>
+            <w:tcW w:type="dxa" w:w="590"/>
             <w:vAlign w:val="center"/>
             <w:tcBorders>
               <w:top w:val="single" w:sz="6" w:color="D9D9D9"/>
@@ -1054,7 +1059,7 @@
         </w:tc>
         <w:tc>
           <w:tcPr>
-            <w:tcW w:type="dxa" w:w="351"/>
+            <w:tcW w:type="dxa" w:w="590"/>
             <w:vAlign w:val="center"/>
             <w:tcBorders>
               <w:top w:val="single" w:sz="6" w:color="D9D9D9"/>
@@ -1084,7 +1089,7 @@
         </w:tc>
         <w:tc>
           <w:tcPr>
-            <w:tcW w:type="dxa" w:w="499"/>
+            <w:tcW w:type="dxa" w:w="658"/>
             <w:vAlign w:val="center"/>
             <w:tcBorders>
               <w:top w:val="single" w:sz="6" w:color="D9D9D9"/>
@@ -1114,7 +1119,7 @@
         </w:tc>
         <w:tc>
           <w:tcPr>
-            <w:tcW w:type="dxa" w:w="1559"/>
+            <w:tcW w:type="dxa" w:w="2103"/>
             <w:vAlign w:val="center"/>
             <w:tcBorders>
               <w:top w:val="single" w:sz="6" w:color="D9D9D9"/>
@@ -1144,7 +1149,7 @@
         </w:tc>
         <w:tc>
           <w:tcPr>
-            <w:tcW w:type="dxa" w:w="408"/>
+            <w:tcW w:type="dxa" w:w="765"/>
             <w:vAlign w:val="center"/>
             <w:tcBorders>
               <w:top w:val="single" w:sz="6" w:color="D9D9D9"/>
@@ -1174,7 +1179,7 @@
         </w:tc>
         <w:tc>
           <w:tcPr>
-            <w:tcW w:type="dxa" w:w="539"/>
+            <w:tcW w:type="dxa" w:w="658"/>
             <w:vAlign w:val="center"/>
             <w:tcBorders>
               <w:top w:val="single" w:sz="6" w:color="D9D9D9"/>
@@ -1206,7 +1211,7 @@
       <w:tr>
         <w:tc>
           <w:tcPr>
-            <w:tcW w:type="dxa" w:w="408"/>
+            <w:tcW w:type="dxa" w:w="669"/>
             <w:vAlign w:val="center"/>
             <w:tcBorders>
               <w:top w:val="single" w:sz="6" w:color="D9D9D9"/>
@@ -1236,7 +1241,7 @@
         </w:tc>
         <w:tc>
           <w:tcPr>
-            <w:tcW w:type="dxa" w:w="1162"/>
+            <w:tcW w:type="dxa" w:w="2228"/>
             <w:vAlign w:val="center"/>
             <w:tcBorders>
               <w:top w:val="single" w:sz="6" w:color="D9D9D9"/>
@@ -1266,7 +1271,7 @@
         </w:tc>
         <w:tc>
           <w:tcPr>
-            <w:tcW w:type="dxa" w:w="425"/>
+            <w:tcW w:type="dxa" w:w="765"/>
             <w:vAlign w:val="center"/>
             <w:tcBorders>
               <w:top w:val="single" w:sz="6" w:color="D9D9D9"/>
@@ -1296,7 +1301,7 @@
         </w:tc>
         <w:tc>
           <w:tcPr>
-            <w:tcW w:type="dxa" w:w="351"/>
+            <w:tcW w:type="dxa" w:w="590"/>
             <w:vAlign w:val="center"/>
             <w:tcBorders>
               <w:top w:val="single" w:sz="6" w:color="D9D9D9"/>
@@ -1326,7 +1331,7 @@
         </w:tc>
         <w:tc>
           <w:tcPr>
-            <w:tcW w:type="dxa" w:w="351"/>
+            <w:tcW w:type="dxa" w:w="590"/>
             <w:vAlign w:val="center"/>
             <w:tcBorders>
               <w:top w:val="single" w:sz="6" w:color="D9D9D9"/>
@@ -1356,7 +1361,7 @@
         </w:tc>
         <w:tc>
           <w:tcPr>
-            <w:tcW w:type="dxa" w:w="499"/>
+            <w:tcW w:type="dxa" w:w="658"/>
             <w:vAlign w:val="center"/>
             <w:tcBorders>
               <w:top w:val="single" w:sz="6" w:color="D9D9D9"/>
@@ -1386,7 +1391,7 @@
         </w:tc>
         <w:tc>
           <w:tcPr>
-            <w:tcW w:type="dxa" w:w="1559"/>
+            <w:tcW w:type="dxa" w:w="2103"/>
             <w:vAlign w:val="center"/>
             <w:tcBorders>
               <w:top w:val="single" w:sz="6" w:color="D9D9D9"/>
@@ -1416,7 +1421,7 @@
         </w:tc>
         <w:tc>
           <w:tcPr>
-            <w:tcW w:type="dxa" w:w="408"/>
+            <w:tcW w:type="dxa" w:w="765"/>
             <w:vAlign w:val="center"/>
             <w:tcBorders>
               <w:top w:val="single" w:sz="6" w:color="D9D9D9"/>
@@ -1446,7 +1451,7 @@
         </w:tc>
         <w:tc>
           <w:tcPr>
-            <w:tcW w:type="dxa" w:w="539"/>
+            <w:tcW w:type="dxa" w:w="658"/>
             <w:vAlign w:val="center"/>
             <w:tcBorders>
               <w:top w:val="single" w:sz="6" w:color="D9D9D9"/>
@@ -1478,7 +1483,7 @@
       <w:tr>
         <w:tc>
           <w:tcPr>
-            <w:tcW w:type="dxa" w:w="408"/>
+            <w:tcW w:type="dxa" w:w="669"/>
             <w:vAlign w:val="center"/>
             <w:tcBorders>
               <w:top w:val="single" w:sz="6" w:color="D9D9D9"/>
@@ -1508,7 +1513,7 @@
         </w:tc>
         <w:tc>
           <w:tcPr>
-            <w:tcW w:type="dxa" w:w="1162"/>
+            <w:tcW w:type="dxa" w:w="2228"/>
             <w:vAlign w:val="center"/>
             <w:tcBorders>
               <w:top w:val="single" w:sz="6" w:color="D9D9D9"/>
@@ -1538,7 +1543,7 @@
         </w:tc>
         <w:tc>
           <w:tcPr>
-            <w:tcW w:type="dxa" w:w="425"/>
+            <w:tcW w:type="dxa" w:w="765"/>
             <w:vAlign w:val="center"/>
             <w:tcBorders>
               <w:top w:val="single" w:sz="6" w:color="D9D9D9"/>
@@ -1568,7 +1573,7 @@
         </w:tc>
         <w:tc>
           <w:tcPr>
-            <w:tcW w:type="dxa" w:w="351"/>
+            <w:tcW w:type="dxa" w:w="590"/>
             <w:vAlign w:val="center"/>
             <w:tcBorders>
               <w:top w:val="single" w:sz="6" w:color="D9D9D9"/>
@@ -1598,7 +1603,7 @@
         </w:tc>
         <w:tc>
           <w:tcPr>
-            <w:tcW w:type="dxa" w:w="351"/>
+            <w:tcW w:type="dxa" w:w="590"/>
             <w:vAlign w:val="center"/>
             <w:tcBorders>
               <w:top w:val="single" w:sz="6" w:color="D9D9D9"/>
@@ -1628,7 +1633,7 @@
         </w:tc>
         <w:tc>
           <w:tcPr>
-            <w:tcW w:type="dxa" w:w="499"/>
+            <w:tcW w:type="dxa" w:w="658"/>
             <w:vAlign w:val="center"/>
             <w:tcBorders>
               <w:top w:val="single" w:sz="6" w:color="D9D9D9"/>
@@ -1658,7 +1663,7 @@
         </w:tc>
         <w:tc>
           <w:tcPr>
-            <w:tcW w:type="dxa" w:w="1559"/>
+            <w:tcW w:type="dxa" w:w="2103"/>
             <w:vAlign w:val="center"/>
             <w:tcBorders>
               <w:top w:val="single" w:sz="6" w:color="D9D9D9"/>
@@ -1688,7 +1693,7 @@
         </w:tc>
         <w:tc>
           <w:tcPr>
-            <w:tcW w:type="dxa" w:w="408"/>
+            <w:tcW w:type="dxa" w:w="765"/>
             <w:vAlign w:val="center"/>
             <w:tcBorders>
               <w:top w:val="single" w:sz="6" w:color="D9D9D9"/>
@@ -1718,7 +1723,7 @@
         </w:tc>
         <w:tc>
           <w:tcPr>
-            <w:tcW w:type="dxa" w:w="539"/>
+            <w:tcW w:type="dxa" w:w="658"/>
             <w:vAlign w:val="center"/>
             <w:tcBorders>
               <w:top w:val="single" w:sz="6" w:color="D9D9D9"/>
@@ -1750,7 +1755,7 @@
       <w:tr>
         <w:tc>
           <w:tcPr>
-            <w:tcW w:type="dxa" w:w="408"/>
+            <w:tcW w:type="dxa" w:w="669"/>
             <w:vAlign w:val="center"/>
             <w:tcBorders>
               <w:top w:val="single" w:sz="6" w:color="D9D9D9"/>
@@ -1780,7 +1785,7 @@
         </w:tc>
         <w:tc>
           <w:tcPr>
-            <w:tcW w:type="dxa" w:w="1162"/>
+            <w:tcW w:type="dxa" w:w="2228"/>
             <w:vAlign w:val="center"/>
             <w:tcBorders>
               <w:top w:val="single" w:sz="6" w:color="D9D9D9"/>
@@ -1810,7 +1815,7 @@
         </w:tc>
         <w:tc>
           <w:tcPr>
-            <w:tcW w:type="dxa" w:w="425"/>
+            <w:tcW w:type="dxa" w:w="765"/>
             <w:vAlign w:val="center"/>
             <w:tcBorders>
               <w:top w:val="single" w:sz="6" w:color="D9D9D9"/>
@@ -1840,7 +1845,7 @@
         </w:tc>
         <w:tc>
           <w:tcPr>
-            <w:tcW w:type="dxa" w:w="351"/>
+            <w:tcW w:type="dxa" w:w="590"/>
             <w:vAlign w:val="center"/>
             <w:tcBorders>
               <w:top w:val="single" w:sz="6" w:color="D9D9D9"/>
@@ -1870,7 +1875,7 @@
         </w:tc>
         <w:tc>
           <w:tcPr>
-            <w:tcW w:type="dxa" w:w="351"/>
+            <w:tcW w:type="dxa" w:w="590"/>
             <w:vAlign w:val="center"/>
             <w:tcBorders>
               <w:top w:val="single" w:sz="6" w:color="D9D9D9"/>
@@ -1900,7 +1905,7 @@
         </w:tc>
         <w:tc>
           <w:tcPr>
-            <w:tcW w:type="dxa" w:w="499"/>
+            <w:tcW w:type="dxa" w:w="658"/>
             <w:vAlign w:val="center"/>
             <w:tcBorders>
               <w:top w:val="single" w:sz="6" w:color="D9D9D9"/>
@@ -1930,7 +1935,7 @@
         </w:tc>
         <w:tc>
           <w:tcPr>
-            <w:tcW w:type="dxa" w:w="1559"/>
+            <w:tcW w:type="dxa" w:w="2103"/>
             <w:vAlign w:val="center"/>
             <w:tcBorders>
               <w:top w:val="single" w:sz="6" w:color="D9D9D9"/>
@@ -1960,7 +1965,7 @@
         </w:tc>
         <w:tc>
           <w:tcPr>
-            <w:tcW w:type="dxa" w:w="408"/>
+            <w:tcW w:type="dxa" w:w="765"/>
             <w:vAlign w:val="center"/>
             <w:tcBorders>
               <w:top w:val="single" w:sz="6" w:color="D9D9D9"/>
@@ -1990,7 +1995,7 @@
         </w:tc>
         <w:tc>
           <w:tcPr>
-            <w:tcW w:type="dxa" w:w="539"/>
+            <w:tcW w:type="dxa" w:w="658"/>
             <w:vAlign w:val="center"/>
             <w:tcBorders>
               <w:top w:val="single" w:sz="6" w:color="D9D9D9"/>
@@ -2022,7 +2027,7 @@
       <w:tr>
         <w:tc>
           <w:tcPr>
-            <w:tcW w:type="dxa" w:w="408"/>
+            <w:tcW w:type="dxa" w:w="669"/>
             <w:vAlign w:val="center"/>
             <w:tcBorders>
               <w:top w:val="single" w:sz="6" w:color="D9D9D9"/>
@@ -2052,7 +2057,7 @@
         </w:tc>
         <w:tc>
           <w:tcPr>
-            <w:tcW w:type="dxa" w:w="1162"/>
+            <w:tcW w:type="dxa" w:w="2228"/>
             <w:vAlign w:val="center"/>
             <w:tcBorders>
               <w:top w:val="single" w:sz="6" w:color="D9D9D9"/>
@@ -2082,7 +2087,7 @@
         </w:tc>
         <w:tc>
           <w:tcPr>
-            <w:tcW w:type="dxa" w:w="425"/>
+            <w:tcW w:type="dxa" w:w="765"/>
             <w:vAlign w:val="center"/>
             <w:tcBorders>
               <w:top w:val="single" w:sz="6" w:color="D9D9D9"/>
@@ -2112,7 +2117,7 @@
         </w:tc>
         <w:tc>
           <w:tcPr>
-            <w:tcW w:type="dxa" w:w="351"/>
+            <w:tcW w:type="dxa" w:w="590"/>
             <w:vAlign w:val="center"/>
             <w:tcBorders>
               <w:top w:val="single" w:sz="6" w:color="D9D9D9"/>
@@ -2142,7 +2147,7 @@
         </w:tc>
         <w:tc>
           <w:tcPr>
-            <w:tcW w:type="dxa" w:w="351"/>
+            <w:tcW w:type="dxa" w:w="590"/>
             <w:vAlign w:val="center"/>
             <w:tcBorders>
               <w:top w:val="single" w:sz="6" w:color="D9D9D9"/>
@@ -2172,7 +2177,7 @@
         </w:tc>
         <w:tc>
           <w:tcPr>
-            <w:tcW w:type="dxa" w:w="499"/>
+            <w:tcW w:type="dxa" w:w="658"/>
             <w:vAlign w:val="center"/>
             <w:tcBorders>
               <w:top w:val="single" w:sz="6" w:color="D9D9D9"/>
@@ -2202,7 +2207,7 @@
         </w:tc>
         <w:tc>
           <w:tcPr>
-            <w:tcW w:type="dxa" w:w="1559"/>
+            <w:tcW w:type="dxa" w:w="2103"/>
             <w:vAlign w:val="center"/>
             <w:tcBorders>
               <w:top w:val="single" w:sz="6" w:color="D9D9D9"/>
@@ -2232,7 +2237,7 @@
         </w:tc>
         <w:tc>
           <w:tcPr>
-            <w:tcW w:type="dxa" w:w="408"/>
+            <w:tcW w:type="dxa" w:w="765"/>
             <w:vAlign w:val="center"/>
             <w:tcBorders>
               <w:top w:val="single" w:sz="6" w:color="D9D9D9"/>
@@ -2262,7 +2267,7 @@
         </w:tc>
         <w:tc>
           <w:tcPr>
-            <w:tcW w:type="dxa" w:w="539"/>
+            <w:tcW w:type="dxa" w:w="658"/>
             <w:vAlign w:val="center"/>
             <w:tcBorders>
               <w:top w:val="single" w:sz="6" w:color="D9D9D9"/>
@@ -2294,7 +2299,7 @@
       <w:tr>
         <w:tc>
           <w:tcPr>
-            <w:tcW w:type="dxa" w:w="408"/>
+            <w:tcW w:type="dxa" w:w="669"/>
             <w:vAlign w:val="center"/>
             <w:tcBorders>
               <w:top w:val="single" w:sz="6" w:color="D9D9D9"/>
@@ -2324,7 +2329,7 @@
         </w:tc>
         <w:tc>
           <w:tcPr>
-            <w:tcW w:type="dxa" w:w="1162"/>
+            <w:tcW w:type="dxa" w:w="2228"/>
             <w:vAlign w:val="center"/>
             <w:tcBorders>
               <w:top w:val="single" w:sz="6" w:color="D9D9D9"/>
@@ -2354,7 +2359,7 @@
         </w:tc>
         <w:tc>
           <w:tcPr>
-            <w:tcW w:type="dxa" w:w="425"/>
+            <w:tcW w:type="dxa" w:w="765"/>
             <w:vAlign w:val="center"/>
             <w:tcBorders>
               <w:top w:val="single" w:sz="6" w:color="D9D9D9"/>
@@ -2384,7 +2389,7 @@
         </w:tc>
         <w:tc>
           <w:tcPr>
-            <w:tcW w:type="dxa" w:w="351"/>
+            <w:tcW w:type="dxa" w:w="590"/>
             <w:vAlign w:val="center"/>
             <w:tcBorders>
               <w:top w:val="single" w:sz="6" w:color="D9D9D9"/>
@@ -2414,7 +2419,7 @@
         </w:tc>
         <w:tc>
           <w:tcPr>
-            <w:tcW w:type="dxa" w:w="351"/>
+            <w:tcW w:type="dxa" w:w="590"/>
             <w:vAlign w:val="center"/>
             <w:tcBorders>
               <w:top w:val="single" w:sz="6" w:color="D9D9D9"/>
@@ -2444,7 +2449,7 @@
         </w:tc>
         <w:tc>
           <w:tcPr>
-            <w:tcW w:type="dxa" w:w="499"/>
+            <w:tcW w:type="dxa" w:w="658"/>
             <w:vAlign w:val="center"/>
             <w:tcBorders>
               <w:top w:val="single" w:sz="6" w:color="D9D9D9"/>
@@ -2474,7 +2479,7 @@
         </w:tc>
         <w:tc>
           <w:tcPr>
-            <w:tcW w:type="dxa" w:w="1559"/>
+            <w:tcW w:type="dxa" w:w="2103"/>
             <w:vAlign w:val="center"/>
             <w:tcBorders>
               <w:top w:val="single" w:sz="6" w:color="D9D9D9"/>
@@ -2504,7 +2509,7 @@
         </w:tc>
         <w:tc>
           <w:tcPr>
-            <w:tcW w:type="dxa" w:w="408"/>
+            <w:tcW w:type="dxa" w:w="765"/>
             <w:vAlign w:val="center"/>
             <w:tcBorders>
               <w:top w:val="single" w:sz="6" w:color="D9D9D9"/>
@@ -2534,7 +2539,7 @@
         </w:tc>
         <w:tc>
           <w:tcPr>
-            <w:tcW w:type="dxa" w:w="539"/>
+            <w:tcW w:type="dxa" w:w="658"/>
             <w:vAlign w:val="center"/>
             <w:tcBorders>
               <w:top w:val="single" w:sz="6" w:color="D9D9D9"/>
@@ -2566,7 +2571,7 @@
       <w:tr>
         <w:tc>
           <w:tcPr>
-            <w:tcW w:type="dxa" w:w="408"/>
+            <w:tcW w:type="dxa" w:w="669"/>
             <w:vAlign w:val="center"/>
             <w:tcBorders>
               <w:top w:val="single" w:sz="6" w:color="D9D9D9"/>
@@ -2596,7 +2601,7 @@
         </w:tc>
         <w:tc>
           <w:tcPr>
-            <w:tcW w:type="dxa" w:w="1162"/>
+            <w:tcW w:type="dxa" w:w="2228"/>
             <w:vAlign w:val="center"/>
             <w:tcBorders>
               <w:top w:val="single" w:sz="6" w:color="D9D9D9"/>
@@ -2626,7 +2631,7 @@
         </w:tc>
         <w:tc>
           <w:tcPr>
-            <w:tcW w:type="dxa" w:w="425"/>
+            <w:tcW w:type="dxa" w:w="765"/>
             <w:vAlign w:val="center"/>
             <w:tcBorders>
               <w:top w:val="single" w:sz="6" w:color="D9D9D9"/>
@@ -2656,7 +2661,7 @@
         </w:tc>
         <w:tc>
           <w:tcPr>
-            <w:tcW w:type="dxa" w:w="351"/>
+            <w:tcW w:type="dxa" w:w="590"/>
             <w:vAlign w:val="center"/>
             <w:tcBorders>
               <w:top w:val="single" w:sz="6" w:color="D9D9D9"/>
@@ -2686,7 +2691,7 @@
         </w:tc>
         <w:tc>
           <w:tcPr>
-            <w:tcW w:type="dxa" w:w="351"/>
+            <w:tcW w:type="dxa" w:w="590"/>
             <w:vAlign w:val="center"/>
             <w:tcBorders>
               <w:top w:val="single" w:sz="6" w:color="D9D9D9"/>
@@ -2716,7 +2721,7 @@
         </w:tc>
         <w:tc>
           <w:tcPr>
-            <w:tcW w:type="dxa" w:w="499"/>
+            <w:tcW w:type="dxa" w:w="658"/>
             <w:vAlign w:val="center"/>
             <w:tcBorders>
               <w:top w:val="single" w:sz="6" w:color="D9D9D9"/>
@@ -2746,7 +2751,7 @@
         </w:tc>
         <w:tc>
           <w:tcPr>
-            <w:tcW w:type="dxa" w:w="1559"/>
+            <w:tcW w:type="dxa" w:w="2103"/>
             <w:vAlign w:val="center"/>
             <w:tcBorders>
               <w:top w:val="single" w:sz="6" w:color="D9D9D9"/>
@@ -2776,7 +2781,7 @@
         </w:tc>
         <w:tc>
           <w:tcPr>
-            <w:tcW w:type="dxa" w:w="408"/>
+            <w:tcW w:type="dxa" w:w="765"/>
             <w:vAlign w:val="center"/>
             <w:tcBorders>
               <w:top w:val="single" w:sz="6" w:color="D9D9D9"/>
@@ -2806,7 +2811,7 @@
         </w:tc>
         <w:tc>
           <w:tcPr>
-            <w:tcW w:type="dxa" w:w="539"/>
+            <w:tcW w:type="dxa" w:w="658"/>
             <w:vAlign w:val="center"/>
             <w:tcBorders>
               <w:top w:val="single" w:sz="6" w:color="D9D9D9"/>
@@ -2838,7 +2843,7 @@
       <w:tr>
         <w:tc>
           <w:tcPr>
-            <w:tcW w:type="dxa" w:w="408"/>
+            <w:tcW w:type="dxa" w:w="669"/>
             <w:vAlign w:val="center"/>
             <w:tcBorders>
               <w:top w:val="single" w:sz="6" w:color="D9D9D9"/>
@@ -2868,7 +2873,7 @@
         </w:tc>
         <w:tc>
           <w:tcPr>
-            <w:tcW w:type="dxa" w:w="1162"/>
+            <w:tcW w:type="dxa" w:w="2228"/>
             <w:vAlign w:val="center"/>
             <w:tcBorders>
               <w:top w:val="single" w:sz="6" w:color="D9D9D9"/>
@@ -2898,7 +2903,7 @@
         </w:tc>
         <w:tc>
           <w:tcPr>
-            <w:tcW w:type="dxa" w:w="425"/>
+            <w:tcW w:type="dxa" w:w="765"/>
             <w:vAlign w:val="center"/>
             <w:tcBorders>
               <w:top w:val="single" w:sz="6" w:color="D9D9D9"/>
@@ -2928,7 +2933,7 @@
         </w:tc>
         <w:tc>
           <w:tcPr>
-            <w:tcW w:type="dxa" w:w="351"/>
+            <w:tcW w:type="dxa" w:w="590"/>
             <w:vAlign w:val="center"/>
             <w:tcBorders>
               <w:top w:val="single" w:sz="6" w:color="D9D9D9"/>
@@ -2958,7 +2963,7 @@
         </w:tc>
         <w:tc>
           <w:tcPr>
-            <w:tcW w:type="dxa" w:w="351"/>
+            <w:tcW w:type="dxa" w:w="590"/>
             <w:vAlign w:val="center"/>
             <w:tcBorders>
               <w:top w:val="single" w:sz="6" w:color="D9D9D9"/>
@@ -2988,7 +2993,7 @@
         </w:tc>
         <w:tc>
           <w:tcPr>
-            <w:tcW w:type="dxa" w:w="499"/>
+            <w:tcW w:type="dxa" w:w="658"/>
             <w:vAlign w:val="center"/>
             <w:tcBorders>
               <w:top w:val="single" w:sz="6" w:color="D9D9D9"/>
@@ -3018,7 +3023,7 @@
         </w:tc>
         <w:tc>
           <w:tcPr>
-            <w:tcW w:type="dxa" w:w="1559"/>
+            <w:tcW w:type="dxa" w:w="2103"/>
             <w:vAlign w:val="center"/>
             <w:tcBorders>
               <w:top w:val="single" w:sz="6" w:color="D9D9D9"/>
@@ -3048,7 +3053,7 @@
         </w:tc>
         <w:tc>
           <w:tcPr>
-            <w:tcW w:type="dxa" w:w="408"/>
+            <w:tcW w:type="dxa" w:w="765"/>
             <w:vAlign w:val="center"/>
             <w:tcBorders>
               <w:top w:val="single" w:sz="6" w:color="D9D9D9"/>
@@ -3078,7 +3083,7 @@
         </w:tc>
         <w:tc>
           <w:tcPr>
-            <w:tcW w:type="dxa" w:w="539"/>
+            <w:tcW w:type="dxa" w:w="658"/>
             <w:vAlign w:val="center"/>
             <w:tcBorders>
               <w:top w:val="single" w:sz="6" w:color="D9D9D9"/>
@@ -3110,7 +3115,7 @@
       <w:tr>
         <w:tc>
           <w:tcPr>
-            <w:tcW w:type="dxa" w:w="408"/>
+            <w:tcW w:type="dxa" w:w="669"/>
             <w:vAlign w:val="center"/>
             <w:tcBorders>
               <w:top w:val="single" w:sz="6" w:color="D9D9D9"/>
@@ -3140,7 +3145,7 @@
         </w:tc>
         <w:tc>
           <w:tcPr>
-            <w:tcW w:type="dxa" w:w="1162"/>
+            <w:tcW w:type="dxa" w:w="2228"/>
             <w:vAlign w:val="center"/>
             <w:tcBorders>
               <w:top w:val="single" w:sz="6" w:color="D9D9D9"/>
@@ -3170,7 +3175,7 @@
         </w:tc>
         <w:tc>
           <w:tcPr>
-            <w:tcW w:type="dxa" w:w="425"/>
+            <w:tcW w:type="dxa" w:w="765"/>
             <w:vAlign w:val="center"/>
             <w:tcBorders>
               <w:top w:val="single" w:sz="6" w:color="D9D9D9"/>
@@ -3200,7 +3205,7 @@
         </w:tc>
         <w:tc>
           <w:tcPr>
-            <w:tcW w:type="dxa" w:w="351"/>
+            <w:tcW w:type="dxa" w:w="590"/>
             <w:vAlign w:val="center"/>
             <w:tcBorders>
               <w:top w:val="single" w:sz="6" w:color="D9D9D9"/>
@@ -3230,7 +3235,7 @@
         </w:tc>
         <w:tc>
           <w:tcPr>
-            <w:tcW w:type="dxa" w:w="351"/>
+            <w:tcW w:type="dxa" w:w="590"/>
             <w:vAlign w:val="center"/>
             <w:tcBorders>
               <w:top w:val="single" w:sz="6" w:color="D9D9D9"/>
@@ -3260,7 +3265,7 @@
         </w:tc>
         <w:tc>
           <w:tcPr>
-            <w:tcW w:type="dxa" w:w="499"/>
+            <w:tcW w:type="dxa" w:w="658"/>
             <w:vAlign w:val="center"/>
             <w:tcBorders>
               <w:top w:val="single" w:sz="6" w:color="D9D9D9"/>
@@ -3290,7 +3295,7 @@
         </w:tc>
         <w:tc>
           <w:tcPr>
-            <w:tcW w:type="dxa" w:w="1559"/>
+            <w:tcW w:type="dxa" w:w="2103"/>
             <w:vAlign w:val="center"/>
             <w:tcBorders>
               <w:top w:val="single" w:sz="6" w:color="D9D9D9"/>
@@ -3320,7 +3325,7 @@
         </w:tc>
         <w:tc>
           <w:tcPr>
-            <w:tcW w:type="dxa" w:w="408"/>
+            <w:tcW w:type="dxa" w:w="765"/>
             <w:vAlign w:val="center"/>
             <w:tcBorders>
               <w:top w:val="single" w:sz="6" w:color="D9D9D9"/>
@@ -3350,7 +3355,7 @@
         </w:tc>
         <w:tc>
           <w:tcPr>
-            <w:tcW w:type="dxa" w:w="539"/>
+            <w:tcW w:type="dxa" w:w="658"/>
             <w:vAlign w:val="center"/>
             <w:tcBorders>
               <w:top w:val="single" w:sz="6" w:color="D9D9D9"/>
@@ -3382,7 +3387,7 @@
       <w:tr>
         <w:tc>
           <w:tcPr>
-            <w:tcW w:type="dxa" w:w="408"/>
+            <w:tcW w:type="dxa" w:w="669"/>
             <w:vAlign w:val="center"/>
             <w:tcBorders>
               <w:top w:val="single" w:sz="6" w:color="D9D9D9"/>
@@ -3412,7 +3417,7 @@
         </w:tc>
         <w:tc>
           <w:tcPr>
-            <w:tcW w:type="dxa" w:w="1162"/>
+            <w:tcW w:type="dxa" w:w="2228"/>
             <w:vAlign w:val="center"/>
             <w:tcBorders>
               <w:top w:val="single" w:sz="6" w:color="D9D9D9"/>
@@ -3442,7 +3447,7 @@
         </w:tc>
         <w:tc>
           <w:tcPr>
-            <w:tcW w:type="dxa" w:w="425"/>
+            <w:tcW w:type="dxa" w:w="765"/>
             <w:vAlign w:val="center"/>
             <w:tcBorders>
               <w:top w:val="single" w:sz="6" w:color="D9D9D9"/>
@@ -3472,7 +3477,7 @@
         </w:tc>
         <w:tc>
           <w:tcPr>
-            <w:tcW w:type="dxa" w:w="351"/>
+            <w:tcW w:type="dxa" w:w="590"/>
             <w:vAlign w:val="center"/>
             <w:tcBorders>
               <w:top w:val="single" w:sz="6" w:color="D9D9D9"/>
@@ -3502,7 +3507,7 @@
         </w:tc>
         <w:tc>
           <w:tcPr>
-            <w:tcW w:type="dxa" w:w="351"/>
+            <w:tcW w:type="dxa" w:w="590"/>
             <w:vAlign w:val="center"/>
             <w:tcBorders>
               <w:top w:val="single" w:sz="6" w:color="D9D9D9"/>
@@ -3532,7 +3537,7 @@
         </w:tc>
         <w:tc>
           <w:tcPr>
-            <w:tcW w:type="dxa" w:w="499"/>
+            <w:tcW w:type="dxa" w:w="658"/>
             <w:vAlign w:val="center"/>
             <w:tcBorders>
               <w:top w:val="single" w:sz="6" w:color="D9D9D9"/>
@@ -3562,7 +3567,7 @@
         </w:tc>
         <w:tc>
           <w:tcPr>
-            <w:tcW w:type="dxa" w:w="1559"/>
+            <w:tcW w:type="dxa" w:w="2103"/>
             <w:vAlign w:val="center"/>
             <w:tcBorders>
               <w:top w:val="single" w:sz="6" w:color="D9D9D9"/>
@@ -3592,7 +3597,7 @@
         </w:tc>
         <w:tc>
           <w:tcPr>
-            <w:tcW w:type="dxa" w:w="408"/>
+            <w:tcW w:type="dxa" w:w="765"/>
             <w:vAlign w:val="center"/>
             <w:tcBorders>
               <w:top w:val="single" w:sz="6" w:color="D9D9D9"/>
@@ -3622,7 +3627,7 @@
         </w:tc>
         <w:tc>
           <w:tcPr>
-            <w:tcW w:type="dxa" w:w="539"/>
+            <w:tcW w:type="dxa" w:w="658"/>
             <w:vAlign w:val="center"/>
             <w:tcBorders>
               <w:top w:val="single" w:sz="6" w:color="D9D9D9"/>
@@ -3654,7 +3659,7 @@
       <w:tr>
         <w:tc>
           <w:tcPr>
-            <w:tcW w:type="dxa" w:w="408"/>
+            <w:tcW w:type="dxa" w:w="669"/>
             <w:vAlign w:val="center"/>
             <w:tcBorders>
               <w:top w:val="single" w:sz="6" w:color="D9D9D9"/>
@@ -3684,7 +3689,7 @@
         </w:tc>
         <w:tc>
           <w:tcPr>
-            <w:tcW w:type="dxa" w:w="1162"/>
+            <w:tcW w:type="dxa" w:w="2228"/>
             <w:vAlign w:val="center"/>
             <w:tcBorders>
               <w:top w:val="single" w:sz="6" w:color="D9D9D9"/>
@@ -3714,7 +3719,7 @@
         </w:tc>
         <w:tc>
           <w:tcPr>
-            <w:tcW w:type="dxa" w:w="425"/>
+            <w:tcW w:type="dxa" w:w="765"/>
             <w:vAlign w:val="center"/>
             <w:tcBorders>
               <w:top w:val="single" w:sz="6" w:color="D9D9D9"/>
@@ -3744,7 +3749,7 @@
         </w:tc>
         <w:tc>
           <w:tcPr>
-            <w:tcW w:type="dxa" w:w="351"/>
+            <w:tcW w:type="dxa" w:w="590"/>
             <w:vAlign w:val="center"/>
             <w:tcBorders>
               <w:top w:val="single" w:sz="6" w:color="D9D9D9"/>
@@ -3774,7 +3779,7 @@
         </w:tc>
         <w:tc>
           <w:tcPr>
-            <w:tcW w:type="dxa" w:w="351"/>
+            <w:tcW w:type="dxa" w:w="590"/>
             <w:vAlign w:val="center"/>
             <w:tcBorders>
               <w:top w:val="single" w:sz="6" w:color="D9D9D9"/>
@@ -3804,7 +3809,7 @@
         </w:tc>
         <w:tc>
           <w:tcPr>
-            <w:tcW w:type="dxa" w:w="499"/>
+            <w:tcW w:type="dxa" w:w="658"/>
             <w:vAlign w:val="center"/>
             <w:tcBorders>
               <w:top w:val="single" w:sz="6" w:color="D9D9D9"/>
@@ -3834,7 +3839,7 @@
         </w:tc>
         <w:tc>
           <w:tcPr>
-            <w:tcW w:type="dxa" w:w="1559"/>
+            <w:tcW w:type="dxa" w:w="2103"/>
             <w:vAlign w:val="center"/>
             <w:tcBorders>
               <w:top w:val="single" w:sz="6" w:color="D9D9D9"/>
@@ -3864,7 +3869,7 @@
         </w:tc>
         <w:tc>
           <w:tcPr>
-            <w:tcW w:type="dxa" w:w="408"/>
+            <w:tcW w:type="dxa" w:w="765"/>
             <w:vAlign w:val="center"/>
             <w:tcBorders>
               <w:top w:val="single" w:sz="6" w:color="D9D9D9"/>
@@ -3894,7 +3899,7 @@
         </w:tc>
         <w:tc>
           <w:tcPr>
-            <w:tcW w:type="dxa" w:w="539"/>
+            <w:tcW w:type="dxa" w:w="658"/>
             <w:vAlign w:val="center"/>
             <w:tcBorders>
               <w:top w:val="single" w:sz="6" w:color="D9D9D9"/>
@@ -3926,7 +3931,7 @@
       <w:tr>
         <w:tc>
           <w:tcPr>
-            <w:tcW w:type="dxa" w:w="408"/>
+            <w:tcW w:type="dxa" w:w="669"/>
             <w:vAlign w:val="center"/>
             <w:tcBorders>
               <w:top w:val="single" w:sz="6" w:color="D9D9D9"/>
@@ -3956,7 +3961,7 @@
         </w:tc>
         <w:tc>
           <w:tcPr>
-            <w:tcW w:type="dxa" w:w="1162"/>
+            <w:tcW w:type="dxa" w:w="2228"/>
             <w:vAlign w:val="center"/>
             <w:tcBorders>
               <w:top w:val="single" w:sz="6" w:color="D9D9D9"/>
@@ -3986,7 +3991,7 @@
         </w:tc>
         <w:tc>
           <w:tcPr>
-            <w:tcW w:type="dxa" w:w="425"/>
+            <w:tcW w:type="dxa" w:w="765"/>
             <w:vAlign w:val="center"/>
             <w:tcBorders>
               <w:top w:val="single" w:sz="6" w:color="D9D9D9"/>
@@ -4016,7 +4021,7 @@
         </w:tc>
         <w:tc>
           <w:tcPr>
-            <w:tcW w:type="dxa" w:w="351"/>
+            <w:tcW w:type="dxa" w:w="590"/>
             <w:vAlign w:val="center"/>
             <w:tcBorders>
               <w:top w:val="single" w:sz="6" w:color="D9D9D9"/>
@@ -4046,7 +4051,7 @@
         </w:tc>
         <w:tc>
           <w:tcPr>
-            <w:tcW w:type="dxa" w:w="351"/>
+            <w:tcW w:type="dxa" w:w="590"/>
             <w:vAlign w:val="center"/>
             <w:tcBorders>
               <w:top w:val="single" w:sz="6" w:color="D9D9D9"/>
@@ -4076,7 +4081,7 @@
         </w:tc>
         <w:tc>
           <w:tcPr>
-            <w:tcW w:type="dxa" w:w="499"/>
+            <w:tcW w:type="dxa" w:w="658"/>
             <w:vAlign w:val="center"/>
             <w:tcBorders>
               <w:top w:val="single" w:sz="6" w:color="D9D9D9"/>
@@ -4106,7 +4111,7 @@
         </w:tc>
         <w:tc>
           <w:tcPr>
-            <w:tcW w:type="dxa" w:w="1559"/>
+            <w:tcW w:type="dxa" w:w="2103"/>
             <w:vAlign w:val="center"/>
             <w:tcBorders>
               <w:top w:val="single" w:sz="6" w:color="D9D9D9"/>
@@ -4136,7 +4141,7 @@
         </w:tc>
         <w:tc>
           <w:tcPr>
-            <w:tcW w:type="dxa" w:w="408"/>
+            <w:tcW w:type="dxa" w:w="765"/>
             <w:vAlign w:val="center"/>
             <w:tcBorders>
               <w:top w:val="single" w:sz="6" w:color="D9D9D9"/>
@@ -4166,7 +4171,7 @@
         </w:tc>
         <w:tc>
           <w:tcPr>
-            <w:tcW w:type="dxa" w:w="539"/>
+            <w:tcW w:type="dxa" w:w="658"/>
             <w:vAlign w:val="center"/>
             <w:tcBorders>
               <w:top w:val="single" w:sz="6" w:color="D9D9D9"/>
@@ -4198,7 +4203,7 @@
       <w:tr>
         <w:tc>
           <w:tcPr>
-            <w:tcW w:type="dxa" w:w="408"/>
+            <w:tcW w:type="dxa" w:w="669"/>
             <w:vAlign w:val="center"/>
             <w:tcBorders>
               <w:top w:val="single" w:sz="6" w:color="D9D9D9"/>
@@ -4228,7 +4233,7 @@
         </w:tc>
         <w:tc>
           <w:tcPr>
-            <w:tcW w:type="dxa" w:w="1162"/>
+            <w:tcW w:type="dxa" w:w="2228"/>
             <w:vAlign w:val="center"/>
             <w:tcBorders>
               <w:top w:val="single" w:sz="6" w:color="D9D9D9"/>
@@ -4258,7 +4263,7 @@
         </w:tc>
         <w:tc>
           <w:tcPr>
-            <w:tcW w:type="dxa" w:w="425"/>
+            <w:tcW w:type="dxa" w:w="765"/>
             <w:vAlign w:val="center"/>
             <w:tcBorders>
               <w:top w:val="single" w:sz="6" w:color="D9D9D9"/>
@@ -4288,7 +4293,7 @@
         </w:tc>
         <w:tc>
           <w:tcPr>
-            <w:tcW w:type="dxa" w:w="351"/>
+            <w:tcW w:type="dxa" w:w="590"/>
             <w:vAlign w:val="center"/>
             <w:tcBorders>
               <w:top w:val="single" w:sz="6" w:color="D9D9D9"/>
@@ -4318,7 +4323,7 @@
         </w:tc>
         <w:tc>
           <w:tcPr>
-            <w:tcW w:type="dxa" w:w="351"/>
+            <w:tcW w:type="dxa" w:w="590"/>
             <w:vAlign w:val="center"/>
             <w:tcBorders>
               <w:top w:val="single" w:sz="6" w:color="D9D9D9"/>
@@ -4348,7 +4353,7 @@
         </w:tc>
         <w:tc>
           <w:tcPr>
-            <w:tcW w:type="dxa" w:w="499"/>
+            <w:tcW w:type="dxa" w:w="658"/>
             <w:vAlign w:val="center"/>
             <w:tcBorders>
               <w:top w:val="single" w:sz="6" w:color="D9D9D9"/>
@@ -4378,7 +4383,7 @@
         </w:tc>
         <w:tc>
           <w:tcPr>
-            <w:tcW w:type="dxa" w:w="1559"/>
+            <w:tcW w:type="dxa" w:w="2103"/>
             <w:vAlign w:val="center"/>
             <w:tcBorders>
               <w:top w:val="single" w:sz="6" w:color="D9D9D9"/>
@@ -4408,7 +4413,7 @@
         </w:tc>
         <w:tc>
           <w:tcPr>
-            <w:tcW w:type="dxa" w:w="408"/>
+            <w:tcW w:type="dxa" w:w="765"/>
             <w:vAlign w:val="center"/>
             <w:tcBorders>
               <w:top w:val="single" w:sz="6" w:color="D9D9D9"/>
@@ -4438,7 +4443,7 @@
         </w:tc>
         <w:tc>
           <w:tcPr>
-            <w:tcW w:type="dxa" w:w="539"/>
+            <w:tcW w:type="dxa" w:w="658"/>
             <w:vAlign w:val="center"/>
             <w:tcBorders>
               <w:top w:val="single" w:sz="6" w:color="D9D9D9"/>
@@ -4470,7 +4475,7 @@
       <w:tr>
         <w:tc>
           <w:tcPr>
-            <w:tcW w:type="dxa" w:w="408"/>
+            <w:tcW w:type="dxa" w:w="669"/>
             <w:vAlign w:val="center"/>
             <w:tcBorders>
               <w:top w:val="single" w:sz="6" w:color="D9D9D9"/>
@@ -4500,7 +4505,7 @@
         </w:tc>
         <w:tc>
           <w:tcPr>
-            <w:tcW w:type="dxa" w:w="1162"/>
+            <w:tcW w:type="dxa" w:w="2228"/>
             <w:vAlign w:val="center"/>
             <w:tcBorders>
               <w:top w:val="single" w:sz="6" w:color="D9D9D9"/>
@@ -4530,7 +4535,7 @@
         </w:tc>
         <w:tc>
           <w:tcPr>
-            <w:tcW w:type="dxa" w:w="425"/>
+            <w:tcW w:type="dxa" w:w="765"/>
             <w:vAlign w:val="center"/>
             <w:tcBorders>
               <w:top w:val="single" w:sz="6" w:color="D9D9D9"/>
@@ -4560,7 +4565,7 @@
         </w:tc>
         <w:tc>
           <w:tcPr>
-            <w:tcW w:type="dxa" w:w="351"/>
+            <w:tcW w:type="dxa" w:w="590"/>
             <w:vAlign w:val="center"/>
             <w:tcBorders>
               <w:top w:val="single" w:sz="6" w:color="D9D9D9"/>
@@ -4590,7 +4595,7 @@
         </w:tc>
         <w:tc>
           <w:tcPr>
-            <w:tcW w:type="dxa" w:w="351"/>
+            <w:tcW w:type="dxa" w:w="590"/>
             <w:vAlign w:val="center"/>
             <w:tcBorders>
               <w:top w:val="single" w:sz="6" w:color="D9D9D9"/>
@@ -4620,7 +4625,7 @@
         </w:tc>
         <w:tc>
           <w:tcPr>
-            <w:tcW w:type="dxa" w:w="499"/>
+            <w:tcW w:type="dxa" w:w="658"/>
             <w:vAlign w:val="center"/>
             <w:tcBorders>
               <w:top w:val="single" w:sz="6" w:color="D9D9D9"/>
@@ -4650,7 +4655,7 @@
         </w:tc>
         <w:tc>
           <w:tcPr>
-            <w:tcW w:type="dxa" w:w="1559"/>
+            <w:tcW w:type="dxa" w:w="2103"/>
             <w:vAlign w:val="center"/>
             <w:tcBorders>
               <w:top w:val="single" w:sz="6" w:color="D9D9D9"/>
@@ -4680,7 +4685,7 @@
         </w:tc>
         <w:tc>
           <w:tcPr>
-            <w:tcW w:type="dxa" w:w="408"/>
+            <w:tcW w:type="dxa" w:w="765"/>
             <w:vAlign w:val="center"/>
             <w:tcBorders>
               <w:top w:val="single" w:sz="6" w:color="D9D9D9"/>
@@ -4710,7 +4715,7 @@
         </w:tc>
         <w:tc>
           <w:tcPr>
-            <w:tcW w:type="dxa" w:w="539"/>
+            <w:tcW w:type="dxa" w:w="658"/>
             <w:vAlign w:val="center"/>
             <w:tcBorders>
               <w:top w:val="single" w:sz="6" w:color="D9D9D9"/>
@@ -4742,7 +4747,7 @@
       <w:tr>
         <w:tc>
           <w:tcPr>
-            <w:tcW w:type="dxa" w:w="408"/>
+            <w:tcW w:type="dxa" w:w="669"/>
             <w:vAlign w:val="center"/>
             <w:tcBorders>
               <w:top w:val="single" w:sz="6" w:color="D9D9D9"/>
@@ -4772,7 +4777,7 @@
         </w:tc>
         <w:tc>
           <w:tcPr>
-            <w:tcW w:type="dxa" w:w="1162"/>
+            <w:tcW w:type="dxa" w:w="2228"/>
             <w:vAlign w:val="center"/>
             <w:tcBorders>
               <w:top w:val="single" w:sz="6" w:color="D9D9D9"/>
@@ -4802,7 +4807,7 @@
         </w:tc>
         <w:tc>
           <w:tcPr>
-            <w:tcW w:type="dxa" w:w="425"/>
+            <w:tcW w:type="dxa" w:w="765"/>
             <w:vAlign w:val="center"/>
             <w:tcBorders>
               <w:top w:val="single" w:sz="6" w:color="D9D9D9"/>
@@ -4832,7 +4837,7 @@
         </w:tc>
         <w:tc>
           <w:tcPr>
-            <w:tcW w:type="dxa" w:w="351"/>
+            <w:tcW w:type="dxa" w:w="590"/>
             <w:vAlign w:val="center"/>
             <w:tcBorders>
               <w:top w:val="single" w:sz="6" w:color="D9D9D9"/>
@@ -4862,7 +4867,7 @@
         </w:tc>
         <w:tc>
           <w:tcPr>
-            <w:tcW w:type="dxa" w:w="351"/>
+            <w:tcW w:type="dxa" w:w="590"/>
             <w:vAlign w:val="center"/>
             <w:tcBorders>
               <w:top w:val="single" w:sz="6" w:color="D9D9D9"/>
@@ -4892,7 +4897,7 @@
         </w:tc>
         <w:tc>
           <w:tcPr>
-            <w:tcW w:type="dxa" w:w="499"/>
+            <w:tcW w:type="dxa" w:w="658"/>
             <w:vAlign w:val="center"/>
             <w:tcBorders>
               <w:top w:val="single" w:sz="6" w:color="D9D9D9"/>
@@ -4922,7 +4927,7 @@
         </w:tc>
         <w:tc>
           <w:tcPr>
-            <w:tcW w:type="dxa" w:w="1559"/>
+            <w:tcW w:type="dxa" w:w="2103"/>
             <w:vAlign w:val="center"/>
             <w:tcBorders>
               <w:top w:val="single" w:sz="6" w:color="D9D9D9"/>
@@ -4952,7 +4957,7 @@
         </w:tc>
         <w:tc>
           <w:tcPr>
-            <w:tcW w:type="dxa" w:w="408"/>
+            <w:tcW w:type="dxa" w:w="765"/>
             <w:vAlign w:val="center"/>
             <w:tcBorders>
               <w:top w:val="single" w:sz="6" w:color="D9D9D9"/>
@@ -4982,7 +4987,7 @@
         </w:tc>
         <w:tc>
           <w:tcPr>
-            <w:tcW w:type="dxa" w:w="539"/>
+            <w:tcW w:type="dxa" w:w="658"/>
             <w:vAlign w:val="center"/>
             <w:tcBorders>
               <w:top w:val="single" w:sz="6" w:color="D9D9D9"/>
@@ -5014,7 +5019,7 @@
       <w:tr>
         <w:tc>
           <w:tcPr>
-            <w:tcW w:type="dxa" w:w="408"/>
+            <w:tcW w:type="dxa" w:w="669"/>
             <w:vAlign w:val="center"/>
             <w:tcBorders>
               <w:top w:val="single" w:sz="6" w:color="D9D9D9"/>
@@ -5044,7 +5049,7 @@
         </w:tc>
         <w:tc>
           <w:tcPr>
-            <w:tcW w:type="dxa" w:w="1162"/>
+            <w:tcW w:type="dxa" w:w="2228"/>
             <w:vAlign w:val="center"/>
             <w:tcBorders>
               <w:top w:val="single" w:sz="6" w:color="D9D9D9"/>
@@ -5074,7 +5079,7 @@
         </w:tc>
         <w:tc>
           <w:tcPr>
-            <w:tcW w:type="dxa" w:w="425"/>
+            <w:tcW w:type="dxa" w:w="765"/>
             <w:vAlign w:val="center"/>
             <w:tcBorders>
               <w:top w:val="single" w:sz="6" w:color="D9D9D9"/>
@@ -5104,7 +5109,7 @@
         </w:tc>
         <w:tc>
           <w:tcPr>
-            <w:tcW w:type="dxa" w:w="351"/>
+            <w:tcW w:type="dxa" w:w="590"/>
             <w:vAlign w:val="center"/>
             <w:tcBorders>
               <w:top w:val="single" w:sz="6" w:color="D9D9D9"/>
@@ -5134,7 +5139,7 @@
         </w:tc>
         <w:tc>
           <w:tcPr>
-            <w:tcW w:type="dxa" w:w="351"/>
+            <w:tcW w:type="dxa" w:w="590"/>
             <w:vAlign w:val="center"/>
             <w:tcBorders>
               <w:top w:val="single" w:sz="6" w:color="D9D9D9"/>
@@ -5164,7 +5169,7 @@
         </w:tc>
         <w:tc>
           <w:tcPr>
-            <w:tcW w:type="dxa" w:w="499"/>
+            <w:tcW w:type="dxa" w:w="658"/>
             <w:vAlign w:val="center"/>
             <w:tcBorders>
               <w:top w:val="single" w:sz="6" w:color="D9D9D9"/>
@@ -5194,7 +5199,7 @@
         </w:tc>
         <w:tc>
           <w:tcPr>
-            <w:tcW w:type="dxa" w:w="1559"/>
+            <w:tcW w:type="dxa" w:w="2103"/>
             <w:vAlign w:val="center"/>
             <w:tcBorders>
               <w:top w:val="single" w:sz="6" w:color="D9D9D9"/>
@@ -5224,7 +5229,7 @@
         </w:tc>
         <w:tc>
           <w:tcPr>
-            <w:tcW w:type="dxa" w:w="408"/>
+            <w:tcW w:type="dxa" w:w="765"/>
             <w:vAlign w:val="center"/>
             <w:tcBorders>
               <w:top w:val="single" w:sz="6" w:color="D9D9D9"/>
@@ -5254,7 +5259,7 @@
         </w:tc>
         <w:tc>
           <w:tcPr>
-            <w:tcW w:type="dxa" w:w="539"/>
+            <w:tcW w:type="dxa" w:w="658"/>
             <w:vAlign w:val="center"/>
             <w:tcBorders>
               <w:top w:val="single" w:sz="6" w:color="D9D9D9"/>
@@ -5313,19 +5318,19 @@
     </w:p>
     <w:tbl>
       <w:tblPr>
-        <w:tblW w:type="dxa" w:w="11225"/>
+        <w:tblW w:type="dxa" w:w="13889"/>
         <w:tblLayout w:type="fixed"/>
         <w:tblLook w:firstColumn="1" w:firstRow="1" w:lastColumn="0" w:lastRow="0" w:noHBand="0" w:noVBand="1" w:val="04A0"/>
         <w:tblInd w:type="dxa" w:w="120"/>
       </w:tblPr>
       <w:tblGrid>
-        <w:gridCol w:w="567"/>
-        <w:gridCol w:w="1729"/>
-        <w:gridCol w:w="1729"/>
-        <w:gridCol w:w="1899"/>
-        <w:gridCol w:w="1899"/>
-        <w:gridCol w:w="2268"/>
-        <w:gridCol w:w="1134"/>
+        <w:gridCol w:w="624"/>
+        <w:gridCol w:w="2324"/>
+        <w:gridCol w:w="2324"/>
+        <w:gridCol w:w="2494"/>
+        <w:gridCol w:w="2494"/>
+        <w:gridCol w:w="2835"/>
+        <w:gridCol w:w="794"/>
       </w:tblGrid>
       <w:tr>
         <w:trPr>
@@ -5333,9 +5338,9 @@
         </w:trPr>
         <w:tc>
           <w:tcPr>
-            <w:tcW w:type="dxa" w:w="567"/>
-            <w:vAlign w:val="center"/>
-            <w:shd w:fill="17365D"/>
+            <w:tcW w:type="dxa" w:w="624"/>
+            <w:vAlign w:val="center"/>
+            <w:shd w:fill="DCE6F1"/>
             <w:tcBorders>
               <w:top w:val="single" w:sz="6" w:color="D9D9D9"/>
               <w:left w:val="single" w:sz="6" w:color="D9D9D9"/>
@@ -5355,7 +5360,7 @@
               <w:rPr>
                 <w:rFonts w:ascii="宋体" w:hAnsi="宋体" w:eastAsia="宋体"/>
                 <w:b/>
-                <w:color w:val="FFFFFF"/>
+                <w:color w:val="000000"/>
                 <w:sz w:val="15"/>
               </w:rPr>
               <w:t>编号</w:t>
@@ -5364,9 +5369,9 @@
         </w:tc>
         <w:tc>
           <w:tcPr>
-            <w:tcW w:type="dxa" w:w="1729"/>
-            <w:vAlign w:val="center"/>
-            <w:shd w:fill="17365D"/>
+            <w:tcW w:type="dxa" w:w="2324"/>
+            <w:vAlign w:val="center"/>
+            <w:shd w:fill="DCE6F1"/>
             <w:tcBorders>
               <w:top w:val="single" w:sz="6" w:color="D9D9D9"/>
               <w:left w:val="single" w:sz="6" w:color="D9D9D9"/>
@@ -5386,7 +5391,7 @@
               <w:rPr>
                 <w:rFonts w:ascii="宋体" w:hAnsi="宋体" w:eastAsia="宋体"/>
                 <w:b/>
-                <w:color w:val="FFFFFF"/>
+                <w:color w:val="000000"/>
                 <w:sz w:val="15"/>
               </w:rPr>
               <w:t>触发条件</w:t>
@@ -5395,9 +5400,9 @@
         </w:tc>
         <w:tc>
           <w:tcPr>
-            <w:tcW w:type="dxa" w:w="1729"/>
-            <w:vAlign w:val="center"/>
-            <w:shd w:fill="17365D"/>
+            <w:tcW w:type="dxa" w:w="2324"/>
+            <w:vAlign w:val="center"/>
+            <w:shd w:fill="DCE6F1"/>
             <w:tcBorders>
               <w:top w:val="single" w:sz="6" w:color="D9D9D9"/>
               <w:left w:val="single" w:sz="6" w:color="D9D9D9"/>
@@ -5417,7 +5422,7 @@
               <w:rPr>
                 <w:rFonts w:ascii="宋体" w:hAnsi="宋体" w:eastAsia="宋体"/>
                 <w:b/>
-                <w:color w:val="FFFFFF"/>
+                <w:color w:val="000000"/>
                 <w:sz w:val="15"/>
               </w:rPr>
               <w:t>可能后果</w:t>
@@ -5426,9 +5431,9 @@
         </w:tc>
         <w:tc>
           <w:tcPr>
-            <w:tcW w:type="dxa" w:w="1899"/>
-            <w:vAlign w:val="center"/>
-            <w:shd w:fill="17365D"/>
+            <w:tcW w:type="dxa" w:w="2494"/>
+            <w:vAlign w:val="center"/>
+            <w:shd w:fill="DCE6F1"/>
             <w:tcBorders>
               <w:top w:val="single" w:sz="6" w:color="D9D9D9"/>
               <w:left w:val="single" w:sz="6" w:color="D9D9D9"/>
@@ -5448,7 +5453,7 @@
               <w:rPr>
                 <w:rFonts w:ascii="宋体" w:hAnsi="宋体" w:eastAsia="宋体"/>
                 <w:b/>
-                <w:color w:val="FFFFFF"/>
+                <w:color w:val="000000"/>
                 <w:sz w:val="15"/>
               </w:rPr>
               <w:t>预防措施</w:t>
@@ -5457,9 +5462,9 @@
         </w:tc>
         <w:tc>
           <w:tcPr>
-            <w:tcW w:type="dxa" w:w="1899"/>
-            <w:vAlign w:val="center"/>
-            <w:shd w:fill="17365D"/>
+            <w:tcW w:type="dxa" w:w="2494"/>
+            <w:vAlign w:val="center"/>
+            <w:shd w:fill="DCE6F1"/>
             <w:tcBorders>
               <w:top w:val="single" w:sz="6" w:color="D9D9D9"/>
               <w:left w:val="single" w:sz="6" w:color="D9D9D9"/>
@@ -5479,7 +5484,7 @@
               <w:rPr>
                 <w:rFonts w:ascii="宋体" w:hAnsi="宋体" w:eastAsia="宋体"/>
                 <w:b/>
-                <w:color w:val="FFFFFF"/>
+                <w:color w:val="000000"/>
                 <w:sz w:val="15"/>
               </w:rPr>
               <w:t>应急措施</w:t>
@@ -5488,9 +5493,9 @@
         </w:tc>
         <w:tc>
           <w:tcPr>
-            <w:tcW w:type="dxa" w:w="2268"/>
-            <w:vAlign w:val="center"/>
-            <w:shd w:fill="17365D"/>
+            <w:tcW w:type="dxa" w:w="2835"/>
+            <w:vAlign w:val="center"/>
+            <w:shd w:fill="DCE6F1"/>
             <w:tcBorders>
               <w:top w:val="single" w:sz="6" w:color="D9D9D9"/>
               <w:left w:val="single" w:sz="6" w:color="D9D9D9"/>
@@ -5510,7 +5515,7 @@
               <w:rPr>
                 <w:rFonts w:ascii="宋体" w:hAnsi="宋体" w:eastAsia="宋体"/>
                 <w:b/>
-                <w:color w:val="FFFFFF"/>
+                <w:color w:val="000000"/>
                 <w:sz w:val="15"/>
               </w:rPr>
               <w:t>WBS/里程碑/Issue 关联</w:t>
@@ -5519,9 +5524,9 @@
         </w:tc>
         <w:tc>
           <w:tcPr>
-            <w:tcW w:type="dxa" w:w="1134"/>
-            <w:vAlign w:val="center"/>
-            <w:shd w:fill="17365D"/>
+            <w:tcW w:type="dxa" w:w="794"/>
+            <w:vAlign w:val="center"/>
+            <w:shd w:fill="DCE6F1"/>
             <w:tcBorders>
               <w:top w:val="single" w:sz="6" w:color="D9D9D9"/>
               <w:left w:val="single" w:sz="6" w:color="D9D9D9"/>
@@ -5541,7 +5546,7 @@
               <w:rPr>
                 <w:rFonts w:ascii="宋体" w:hAnsi="宋体" w:eastAsia="宋体"/>
                 <w:b/>
-                <w:color w:val="FFFFFF"/>
+                <w:color w:val="000000"/>
                 <w:sz w:val="15"/>
               </w:rPr>
               <w:t>状态</w:t>
@@ -5552,7 +5557,7 @@
       <w:tr>
         <w:tc>
           <w:tcPr>
-            <w:tcW w:type="dxa" w:w="567"/>
+            <w:tcW w:type="dxa" w:w="624"/>
             <w:vAlign w:val="center"/>
             <w:tcBorders>
               <w:top w:val="single" w:sz="6" w:color="D9D9D9"/>
@@ -5582,7 +5587,7 @@
         </w:tc>
         <w:tc>
           <w:tcPr>
-            <w:tcW w:type="dxa" w:w="1729"/>
+            <w:tcW w:type="dxa" w:w="2324"/>
             <w:vAlign w:val="center"/>
             <w:tcBorders>
               <w:top w:val="single" w:sz="6" w:color="D9D9D9"/>
@@ -5612,7 +5617,7 @@
         </w:tc>
         <w:tc>
           <w:tcPr>
-            <w:tcW w:type="dxa" w:w="1729"/>
+            <w:tcW w:type="dxa" w:w="2324"/>
             <w:vAlign w:val="center"/>
             <w:tcBorders>
               <w:top w:val="single" w:sz="6" w:color="D9D9D9"/>
@@ -5642,7 +5647,7 @@
         </w:tc>
         <w:tc>
           <w:tcPr>
-            <w:tcW w:type="dxa" w:w="1899"/>
+            <w:tcW w:type="dxa" w:w="2494"/>
             <w:vAlign w:val="center"/>
             <w:tcBorders>
               <w:top w:val="single" w:sz="6" w:color="D9D9D9"/>
@@ -5672,7 +5677,7 @@
         </w:tc>
         <w:tc>
           <w:tcPr>
-            <w:tcW w:type="dxa" w:w="1899"/>
+            <w:tcW w:type="dxa" w:w="2494"/>
             <w:vAlign w:val="center"/>
             <w:tcBorders>
               <w:top w:val="single" w:sz="6" w:color="D9D9D9"/>
@@ -5702,7 +5707,7 @@
         </w:tc>
         <w:tc>
           <w:tcPr>
-            <w:tcW w:type="dxa" w:w="2268"/>
+            <w:tcW w:type="dxa" w:w="2835"/>
             <w:vAlign w:val="center"/>
             <w:tcBorders>
               <w:top w:val="single" w:sz="6" w:color="D9D9D9"/>
@@ -5732,7 +5737,7 @@
         </w:tc>
         <w:tc>
           <w:tcPr>
-            <w:tcW w:type="dxa" w:w="1134"/>
+            <w:tcW w:type="dxa" w:w="794"/>
             <w:vAlign w:val="center"/>
             <w:tcBorders>
               <w:top w:val="single" w:sz="6" w:color="D9D9D9"/>
@@ -5764,7 +5769,7 @@
       <w:tr>
         <w:tc>
           <w:tcPr>
-            <w:tcW w:type="dxa" w:w="567"/>
+            <w:tcW w:type="dxa" w:w="624"/>
             <w:vAlign w:val="center"/>
             <w:tcBorders>
               <w:top w:val="single" w:sz="6" w:color="D9D9D9"/>
@@ -5794,7 +5799,7 @@
         </w:tc>
         <w:tc>
           <w:tcPr>
-            <w:tcW w:type="dxa" w:w="1729"/>
+            <w:tcW w:type="dxa" w:w="2324"/>
             <w:vAlign w:val="center"/>
             <w:tcBorders>
               <w:top w:val="single" w:sz="6" w:color="D9D9D9"/>
@@ -5824,7 +5829,7 @@
         </w:tc>
         <w:tc>
           <w:tcPr>
-            <w:tcW w:type="dxa" w:w="1729"/>
+            <w:tcW w:type="dxa" w:w="2324"/>
             <w:vAlign w:val="center"/>
             <w:tcBorders>
               <w:top w:val="single" w:sz="6" w:color="D9D9D9"/>
@@ -5854,7 +5859,7 @@
         </w:tc>
         <w:tc>
           <w:tcPr>
-            <w:tcW w:type="dxa" w:w="1899"/>
+            <w:tcW w:type="dxa" w:w="2494"/>
             <w:vAlign w:val="center"/>
             <w:tcBorders>
               <w:top w:val="single" w:sz="6" w:color="D9D9D9"/>
@@ -5884,7 +5889,7 @@
         </w:tc>
         <w:tc>
           <w:tcPr>
-            <w:tcW w:type="dxa" w:w="1899"/>
+            <w:tcW w:type="dxa" w:w="2494"/>
             <w:vAlign w:val="center"/>
             <w:tcBorders>
               <w:top w:val="single" w:sz="6" w:color="D9D9D9"/>
@@ -5914,7 +5919,7 @@
         </w:tc>
         <w:tc>
           <w:tcPr>
-            <w:tcW w:type="dxa" w:w="2268"/>
+            <w:tcW w:type="dxa" w:w="2835"/>
             <w:vAlign w:val="center"/>
             <w:tcBorders>
               <w:top w:val="single" w:sz="6" w:color="D9D9D9"/>
@@ -5944,7 +5949,7 @@
         </w:tc>
         <w:tc>
           <w:tcPr>
-            <w:tcW w:type="dxa" w:w="1134"/>
+            <w:tcW w:type="dxa" w:w="794"/>
             <w:vAlign w:val="center"/>
             <w:tcBorders>
               <w:top w:val="single" w:sz="6" w:color="D9D9D9"/>
@@ -5976,7 +5981,7 @@
       <w:tr>
         <w:tc>
           <w:tcPr>
-            <w:tcW w:type="dxa" w:w="567"/>
+            <w:tcW w:type="dxa" w:w="624"/>
             <w:vAlign w:val="center"/>
             <w:tcBorders>
               <w:top w:val="single" w:sz="6" w:color="D9D9D9"/>
@@ -6006,7 +6011,7 @@
         </w:tc>
         <w:tc>
           <w:tcPr>
-            <w:tcW w:type="dxa" w:w="1729"/>
+            <w:tcW w:type="dxa" w:w="2324"/>
             <w:vAlign w:val="center"/>
             <w:tcBorders>
               <w:top w:val="single" w:sz="6" w:color="D9D9D9"/>
@@ -6036,7 +6041,7 @@
         </w:tc>
         <w:tc>
           <w:tcPr>
-            <w:tcW w:type="dxa" w:w="1729"/>
+            <w:tcW w:type="dxa" w:w="2324"/>
             <w:vAlign w:val="center"/>
             <w:tcBorders>
               <w:top w:val="single" w:sz="6" w:color="D9D9D9"/>
@@ -6066,7 +6071,7 @@
         </w:tc>
         <w:tc>
           <w:tcPr>
-            <w:tcW w:type="dxa" w:w="1899"/>
+            <w:tcW w:type="dxa" w:w="2494"/>
             <w:vAlign w:val="center"/>
             <w:tcBorders>
               <w:top w:val="single" w:sz="6" w:color="D9D9D9"/>
@@ -6096,7 +6101,7 @@
         </w:tc>
         <w:tc>
           <w:tcPr>
-            <w:tcW w:type="dxa" w:w="1899"/>
+            <w:tcW w:type="dxa" w:w="2494"/>
             <w:vAlign w:val="center"/>
             <w:tcBorders>
               <w:top w:val="single" w:sz="6" w:color="D9D9D9"/>
@@ -6126,7 +6131,7 @@
         </w:tc>
         <w:tc>
           <w:tcPr>
-            <w:tcW w:type="dxa" w:w="2268"/>
+            <w:tcW w:type="dxa" w:w="2835"/>
             <w:vAlign w:val="center"/>
             <w:tcBorders>
               <w:top w:val="single" w:sz="6" w:color="D9D9D9"/>
@@ -6156,7 +6161,7 @@
         </w:tc>
         <w:tc>
           <w:tcPr>
-            <w:tcW w:type="dxa" w:w="1134"/>
+            <w:tcW w:type="dxa" w:w="794"/>
             <w:vAlign w:val="center"/>
             <w:tcBorders>
               <w:top w:val="single" w:sz="6" w:color="D9D9D9"/>
@@ -6188,7 +6193,7 @@
       <w:tr>
         <w:tc>
           <w:tcPr>
-            <w:tcW w:type="dxa" w:w="567"/>
+            <w:tcW w:type="dxa" w:w="624"/>
             <w:vAlign w:val="center"/>
             <w:tcBorders>
               <w:top w:val="single" w:sz="6" w:color="D9D9D9"/>
@@ -6218,7 +6223,7 @@
         </w:tc>
         <w:tc>
           <w:tcPr>
-            <w:tcW w:type="dxa" w:w="1729"/>
+            <w:tcW w:type="dxa" w:w="2324"/>
             <w:vAlign w:val="center"/>
             <w:tcBorders>
               <w:top w:val="single" w:sz="6" w:color="D9D9D9"/>
@@ -6248,7 +6253,7 @@
         </w:tc>
         <w:tc>
           <w:tcPr>
-            <w:tcW w:type="dxa" w:w="1729"/>
+            <w:tcW w:type="dxa" w:w="2324"/>
             <w:vAlign w:val="center"/>
             <w:tcBorders>
               <w:top w:val="single" w:sz="6" w:color="D9D9D9"/>
@@ -6278,7 +6283,7 @@
         </w:tc>
         <w:tc>
           <w:tcPr>
-            <w:tcW w:type="dxa" w:w="1899"/>
+            <w:tcW w:type="dxa" w:w="2494"/>
             <w:vAlign w:val="center"/>
             <w:tcBorders>
               <w:top w:val="single" w:sz="6" w:color="D9D9D9"/>
@@ -6308,7 +6313,7 @@
         </w:tc>
         <w:tc>
           <w:tcPr>
-            <w:tcW w:type="dxa" w:w="1899"/>
+            <w:tcW w:type="dxa" w:w="2494"/>
             <w:vAlign w:val="center"/>
             <w:tcBorders>
               <w:top w:val="single" w:sz="6" w:color="D9D9D9"/>
@@ -6338,7 +6343,7 @@
         </w:tc>
         <w:tc>
           <w:tcPr>
-            <w:tcW w:type="dxa" w:w="2268"/>
+            <w:tcW w:type="dxa" w:w="2835"/>
             <w:vAlign w:val="center"/>
             <w:tcBorders>
               <w:top w:val="single" w:sz="6" w:color="D9D9D9"/>
@@ -6368,7 +6373,7 @@
         </w:tc>
         <w:tc>
           <w:tcPr>
-            <w:tcW w:type="dxa" w:w="1134"/>
+            <w:tcW w:type="dxa" w:w="794"/>
             <w:vAlign w:val="center"/>
             <w:tcBorders>
               <w:top w:val="single" w:sz="6" w:color="D9D9D9"/>
@@ -6400,7 +6405,7 @@
       <w:tr>
         <w:tc>
           <w:tcPr>
-            <w:tcW w:type="dxa" w:w="567"/>
+            <w:tcW w:type="dxa" w:w="624"/>
             <w:vAlign w:val="center"/>
             <w:tcBorders>
               <w:top w:val="single" w:sz="6" w:color="D9D9D9"/>
@@ -6430,7 +6435,7 @@
         </w:tc>
         <w:tc>
           <w:tcPr>
-            <w:tcW w:type="dxa" w:w="1729"/>
+            <w:tcW w:type="dxa" w:w="2324"/>
             <w:vAlign w:val="center"/>
             <w:tcBorders>
               <w:top w:val="single" w:sz="6" w:color="D9D9D9"/>
@@ -6460,7 +6465,7 @@
         </w:tc>
         <w:tc>
           <w:tcPr>
-            <w:tcW w:type="dxa" w:w="1729"/>
+            <w:tcW w:type="dxa" w:w="2324"/>
             <w:vAlign w:val="center"/>
             <w:tcBorders>
               <w:top w:val="single" w:sz="6" w:color="D9D9D9"/>
@@ -6490,7 +6495,7 @@
         </w:tc>
         <w:tc>
           <w:tcPr>
-            <w:tcW w:type="dxa" w:w="1899"/>
+            <w:tcW w:type="dxa" w:w="2494"/>
             <w:vAlign w:val="center"/>
             <w:tcBorders>
               <w:top w:val="single" w:sz="6" w:color="D9D9D9"/>
@@ -6520,7 +6525,7 @@
         </w:tc>
         <w:tc>
           <w:tcPr>
-            <w:tcW w:type="dxa" w:w="1899"/>
+            <w:tcW w:type="dxa" w:w="2494"/>
             <w:vAlign w:val="center"/>
             <w:tcBorders>
               <w:top w:val="single" w:sz="6" w:color="D9D9D9"/>
@@ -6550,7 +6555,7 @@
         </w:tc>
         <w:tc>
           <w:tcPr>
-            <w:tcW w:type="dxa" w:w="2268"/>
+            <w:tcW w:type="dxa" w:w="2835"/>
             <w:vAlign w:val="center"/>
             <w:tcBorders>
               <w:top w:val="single" w:sz="6" w:color="D9D9D9"/>
@@ -6580,7 +6585,7 @@
         </w:tc>
         <w:tc>
           <w:tcPr>
-            <w:tcW w:type="dxa" w:w="1134"/>
+            <w:tcW w:type="dxa" w:w="794"/>
             <w:vAlign w:val="center"/>
             <w:tcBorders>
               <w:top w:val="single" w:sz="6" w:color="D9D9D9"/>
@@ -6612,7 +6617,7 @@
       <w:tr>
         <w:tc>
           <w:tcPr>
-            <w:tcW w:type="dxa" w:w="567"/>
+            <w:tcW w:type="dxa" w:w="624"/>
             <w:vAlign w:val="center"/>
             <w:tcBorders>
               <w:top w:val="single" w:sz="6" w:color="D9D9D9"/>
@@ -6642,7 +6647,7 @@
         </w:tc>
         <w:tc>
           <w:tcPr>
-            <w:tcW w:type="dxa" w:w="1729"/>
+            <w:tcW w:type="dxa" w:w="2324"/>
             <w:vAlign w:val="center"/>
             <w:tcBorders>
               <w:top w:val="single" w:sz="6" w:color="D9D9D9"/>
@@ -6672,7 +6677,7 @@
         </w:tc>
         <w:tc>
           <w:tcPr>
-            <w:tcW w:type="dxa" w:w="1729"/>
+            <w:tcW w:type="dxa" w:w="2324"/>
             <w:vAlign w:val="center"/>
             <w:tcBorders>
               <w:top w:val="single" w:sz="6" w:color="D9D9D9"/>
@@ -6702,7 +6707,7 @@
         </w:tc>
         <w:tc>
           <w:tcPr>
-            <w:tcW w:type="dxa" w:w="1899"/>
+            <w:tcW w:type="dxa" w:w="2494"/>
             <w:vAlign w:val="center"/>
             <w:tcBorders>
               <w:top w:val="single" w:sz="6" w:color="D9D9D9"/>
@@ -6732,7 +6737,7 @@
         </w:tc>
         <w:tc>
           <w:tcPr>
-            <w:tcW w:type="dxa" w:w="1899"/>
+            <w:tcW w:type="dxa" w:w="2494"/>
             <w:vAlign w:val="center"/>
             <w:tcBorders>
               <w:top w:val="single" w:sz="6" w:color="D9D9D9"/>
@@ -6762,7 +6767,7 @@
         </w:tc>
         <w:tc>
           <w:tcPr>
-            <w:tcW w:type="dxa" w:w="2268"/>
+            <w:tcW w:type="dxa" w:w="2835"/>
             <w:vAlign w:val="center"/>
             <w:tcBorders>
               <w:top w:val="single" w:sz="6" w:color="D9D9D9"/>
@@ -6792,7 +6797,7 @@
         </w:tc>
         <w:tc>
           <w:tcPr>
-            <w:tcW w:type="dxa" w:w="1134"/>
+            <w:tcW w:type="dxa" w:w="794"/>
             <w:vAlign w:val="center"/>
             <w:tcBorders>
               <w:top w:val="single" w:sz="6" w:color="D9D9D9"/>
@@ -6824,7 +6829,7 @@
       <w:tr>
         <w:tc>
           <w:tcPr>
-            <w:tcW w:type="dxa" w:w="567"/>
+            <w:tcW w:type="dxa" w:w="624"/>
             <w:vAlign w:val="center"/>
             <w:tcBorders>
               <w:top w:val="single" w:sz="6" w:color="D9D9D9"/>
@@ -6854,7 +6859,7 @@
         </w:tc>
         <w:tc>
           <w:tcPr>
-            <w:tcW w:type="dxa" w:w="1729"/>
+            <w:tcW w:type="dxa" w:w="2324"/>
             <w:vAlign w:val="center"/>
             <w:tcBorders>
               <w:top w:val="single" w:sz="6" w:color="D9D9D9"/>
@@ -6884,7 +6889,7 @@
         </w:tc>
         <w:tc>
           <w:tcPr>
-            <w:tcW w:type="dxa" w:w="1729"/>
+            <w:tcW w:type="dxa" w:w="2324"/>
             <w:vAlign w:val="center"/>
             <w:tcBorders>
               <w:top w:val="single" w:sz="6" w:color="D9D9D9"/>
@@ -6914,7 +6919,7 @@
         </w:tc>
         <w:tc>
           <w:tcPr>
-            <w:tcW w:type="dxa" w:w="1899"/>
+            <w:tcW w:type="dxa" w:w="2494"/>
             <w:vAlign w:val="center"/>
             <w:tcBorders>
               <w:top w:val="single" w:sz="6" w:color="D9D9D9"/>
@@ -6944,7 +6949,7 @@
         </w:tc>
         <w:tc>
           <w:tcPr>
-            <w:tcW w:type="dxa" w:w="1899"/>
+            <w:tcW w:type="dxa" w:w="2494"/>
             <w:vAlign w:val="center"/>
             <w:tcBorders>
               <w:top w:val="single" w:sz="6" w:color="D9D9D9"/>
@@ -6974,7 +6979,7 @@
         </w:tc>
         <w:tc>
           <w:tcPr>
-            <w:tcW w:type="dxa" w:w="2268"/>
+            <w:tcW w:type="dxa" w:w="2835"/>
             <w:vAlign w:val="center"/>
             <w:tcBorders>
               <w:top w:val="single" w:sz="6" w:color="D9D9D9"/>
@@ -7004,7 +7009,7 @@
         </w:tc>
         <w:tc>
           <w:tcPr>
-            <w:tcW w:type="dxa" w:w="1134"/>
+            <w:tcW w:type="dxa" w:w="794"/>
             <w:vAlign w:val="center"/>
             <w:tcBorders>
               <w:top w:val="single" w:sz="6" w:color="D9D9D9"/>
@@ -7036,7 +7041,7 @@
       <w:tr>
         <w:tc>
           <w:tcPr>
-            <w:tcW w:type="dxa" w:w="567"/>
+            <w:tcW w:type="dxa" w:w="624"/>
             <w:vAlign w:val="center"/>
             <w:tcBorders>
               <w:top w:val="single" w:sz="6" w:color="D9D9D9"/>
@@ -7066,7 +7071,7 @@
         </w:tc>
         <w:tc>
           <w:tcPr>
-            <w:tcW w:type="dxa" w:w="1729"/>
+            <w:tcW w:type="dxa" w:w="2324"/>
             <w:vAlign w:val="center"/>
             <w:tcBorders>
               <w:top w:val="single" w:sz="6" w:color="D9D9D9"/>
@@ -7096,7 +7101,7 @@
         </w:tc>
         <w:tc>
           <w:tcPr>
-            <w:tcW w:type="dxa" w:w="1729"/>
+            <w:tcW w:type="dxa" w:w="2324"/>
             <w:vAlign w:val="center"/>
             <w:tcBorders>
               <w:top w:val="single" w:sz="6" w:color="D9D9D9"/>
@@ -7126,7 +7131,7 @@
         </w:tc>
         <w:tc>
           <w:tcPr>
-            <w:tcW w:type="dxa" w:w="1899"/>
+            <w:tcW w:type="dxa" w:w="2494"/>
             <w:vAlign w:val="center"/>
             <w:tcBorders>
               <w:top w:val="single" w:sz="6" w:color="D9D9D9"/>
@@ -7156,7 +7161,7 @@
         </w:tc>
         <w:tc>
           <w:tcPr>
-            <w:tcW w:type="dxa" w:w="1899"/>
+            <w:tcW w:type="dxa" w:w="2494"/>
             <w:vAlign w:val="center"/>
             <w:tcBorders>
               <w:top w:val="single" w:sz="6" w:color="D9D9D9"/>
@@ -7186,7 +7191,7 @@
         </w:tc>
         <w:tc>
           <w:tcPr>
-            <w:tcW w:type="dxa" w:w="2268"/>
+            <w:tcW w:type="dxa" w:w="2835"/>
             <w:vAlign w:val="center"/>
             <w:tcBorders>
               <w:top w:val="single" w:sz="6" w:color="D9D9D9"/>
@@ -7216,7 +7221,7 @@
         </w:tc>
         <w:tc>
           <w:tcPr>
-            <w:tcW w:type="dxa" w:w="1134"/>
+            <w:tcW w:type="dxa" w:w="794"/>
             <w:vAlign w:val="center"/>
             <w:tcBorders>
               <w:top w:val="single" w:sz="6" w:color="D9D9D9"/>
@@ -7248,7 +7253,7 @@
       <w:tr>
         <w:tc>
           <w:tcPr>
-            <w:tcW w:type="dxa" w:w="567"/>
+            <w:tcW w:type="dxa" w:w="624"/>
             <w:vAlign w:val="center"/>
             <w:tcBorders>
               <w:top w:val="single" w:sz="6" w:color="D9D9D9"/>
@@ -7278,7 +7283,7 @@
         </w:tc>
         <w:tc>
           <w:tcPr>
-            <w:tcW w:type="dxa" w:w="1729"/>
+            <w:tcW w:type="dxa" w:w="2324"/>
             <w:vAlign w:val="center"/>
             <w:tcBorders>
               <w:top w:val="single" w:sz="6" w:color="D9D9D9"/>
@@ -7308,7 +7313,7 @@
         </w:tc>
         <w:tc>
           <w:tcPr>
-            <w:tcW w:type="dxa" w:w="1729"/>
+            <w:tcW w:type="dxa" w:w="2324"/>
             <w:vAlign w:val="center"/>
             <w:tcBorders>
               <w:top w:val="single" w:sz="6" w:color="D9D9D9"/>
@@ -7338,7 +7343,7 @@
         </w:tc>
         <w:tc>
           <w:tcPr>
-            <w:tcW w:type="dxa" w:w="1899"/>
+            <w:tcW w:type="dxa" w:w="2494"/>
             <w:vAlign w:val="center"/>
             <w:tcBorders>
               <w:top w:val="single" w:sz="6" w:color="D9D9D9"/>
@@ -7368,7 +7373,7 @@
         </w:tc>
         <w:tc>
           <w:tcPr>
-            <w:tcW w:type="dxa" w:w="1899"/>
+            <w:tcW w:type="dxa" w:w="2494"/>
             <w:vAlign w:val="center"/>
             <w:tcBorders>
               <w:top w:val="single" w:sz="6" w:color="D9D9D9"/>
@@ -7398,7 +7403,7 @@
         </w:tc>
         <w:tc>
           <w:tcPr>
-            <w:tcW w:type="dxa" w:w="2268"/>
+            <w:tcW w:type="dxa" w:w="2835"/>
             <w:vAlign w:val="center"/>
             <w:tcBorders>
               <w:top w:val="single" w:sz="6" w:color="D9D9D9"/>
@@ -7428,7 +7433,7 @@
         </w:tc>
         <w:tc>
           <w:tcPr>
-            <w:tcW w:type="dxa" w:w="1134"/>
+            <w:tcW w:type="dxa" w:w="794"/>
             <w:vAlign w:val="center"/>
             <w:tcBorders>
               <w:top w:val="single" w:sz="6" w:color="D9D9D9"/>
@@ -7460,7 +7465,7 @@
       <w:tr>
         <w:tc>
           <w:tcPr>
-            <w:tcW w:type="dxa" w:w="567"/>
+            <w:tcW w:type="dxa" w:w="624"/>
             <w:vAlign w:val="center"/>
             <w:tcBorders>
               <w:top w:val="single" w:sz="6" w:color="D9D9D9"/>
@@ -7490,7 +7495,7 @@
         </w:tc>
         <w:tc>
           <w:tcPr>
-            <w:tcW w:type="dxa" w:w="1729"/>
+            <w:tcW w:type="dxa" w:w="2324"/>
             <w:vAlign w:val="center"/>
             <w:tcBorders>
               <w:top w:val="single" w:sz="6" w:color="D9D9D9"/>
@@ -7520,7 +7525,7 @@
         </w:tc>
         <w:tc>
           <w:tcPr>
-            <w:tcW w:type="dxa" w:w="1729"/>
+            <w:tcW w:type="dxa" w:w="2324"/>
             <w:vAlign w:val="center"/>
             <w:tcBorders>
               <w:top w:val="single" w:sz="6" w:color="D9D9D9"/>
@@ -7550,7 +7555,7 @@
         </w:tc>
         <w:tc>
           <w:tcPr>
-            <w:tcW w:type="dxa" w:w="1899"/>
+            <w:tcW w:type="dxa" w:w="2494"/>
             <w:vAlign w:val="center"/>
             <w:tcBorders>
               <w:top w:val="single" w:sz="6" w:color="D9D9D9"/>
@@ -7580,7 +7585,7 @@
         </w:tc>
         <w:tc>
           <w:tcPr>
-            <w:tcW w:type="dxa" w:w="1899"/>
+            <w:tcW w:type="dxa" w:w="2494"/>
             <w:vAlign w:val="center"/>
             <w:tcBorders>
               <w:top w:val="single" w:sz="6" w:color="D9D9D9"/>
@@ -7610,7 +7615,7 @@
         </w:tc>
         <w:tc>
           <w:tcPr>
-            <w:tcW w:type="dxa" w:w="2268"/>
+            <w:tcW w:type="dxa" w:w="2835"/>
             <w:vAlign w:val="center"/>
             <w:tcBorders>
               <w:top w:val="single" w:sz="6" w:color="D9D9D9"/>
@@ -7640,7 +7645,7 @@
         </w:tc>
         <w:tc>
           <w:tcPr>
-            <w:tcW w:type="dxa" w:w="1134"/>
+            <w:tcW w:type="dxa" w:w="794"/>
             <w:vAlign w:val="center"/>
             <w:tcBorders>
               <w:top w:val="single" w:sz="6" w:color="D9D9D9"/>
@@ -7672,7 +7677,7 @@
       <w:tr>
         <w:tc>
           <w:tcPr>
-            <w:tcW w:type="dxa" w:w="567"/>
+            <w:tcW w:type="dxa" w:w="624"/>
             <w:vAlign w:val="center"/>
             <w:tcBorders>
               <w:top w:val="single" w:sz="6" w:color="D9D9D9"/>
@@ -7702,7 +7707,7 @@
         </w:tc>
         <w:tc>
           <w:tcPr>
-            <w:tcW w:type="dxa" w:w="1729"/>
+            <w:tcW w:type="dxa" w:w="2324"/>
             <w:vAlign w:val="center"/>
             <w:tcBorders>
               <w:top w:val="single" w:sz="6" w:color="D9D9D9"/>
@@ -7732,7 +7737,7 @@
         </w:tc>
         <w:tc>
           <w:tcPr>
-            <w:tcW w:type="dxa" w:w="1729"/>
+            <w:tcW w:type="dxa" w:w="2324"/>
             <w:vAlign w:val="center"/>
             <w:tcBorders>
               <w:top w:val="single" w:sz="6" w:color="D9D9D9"/>
@@ -7762,7 +7767,7 @@
         </w:tc>
         <w:tc>
           <w:tcPr>
-            <w:tcW w:type="dxa" w:w="1899"/>
+            <w:tcW w:type="dxa" w:w="2494"/>
             <w:vAlign w:val="center"/>
             <w:tcBorders>
               <w:top w:val="single" w:sz="6" w:color="D9D9D9"/>
@@ -7792,7 +7797,7 @@
         </w:tc>
         <w:tc>
           <w:tcPr>
-            <w:tcW w:type="dxa" w:w="1899"/>
+            <w:tcW w:type="dxa" w:w="2494"/>
             <w:vAlign w:val="center"/>
             <w:tcBorders>
               <w:top w:val="single" w:sz="6" w:color="D9D9D9"/>
@@ -7822,7 +7827,7 @@
         </w:tc>
         <w:tc>
           <w:tcPr>
-            <w:tcW w:type="dxa" w:w="2268"/>
+            <w:tcW w:type="dxa" w:w="2835"/>
             <w:vAlign w:val="center"/>
             <w:tcBorders>
               <w:top w:val="single" w:sz="6" w:color="D9D9D9"/>
@@ -7852,7 +7857,7 @@
         </w:tc>
         <w:tc>
           <w:tcPr>
-            <w:tcW w:type="dxa" w:w="1134"/>
+            <w:tcW w:type="dxa" w:w="794"/>
             <w:vAlign w:val="center"/>
             <w:tcBorders>
               <w:top w:val="single" w:sz="6" w:color="D9D9D9"/>
@@ -7884,7 +7889,7 @@
       <w:tr>
         <w:tc>
           <w:tcPr>
-            <w:tcW w:type="dxa" w:w="567"/>
+            <w:tcW w:type="dxa" w:w="624"/>
             <w:vAlign w:val="center"/>
             <w:tcBorders>
               <w:top w:val="single" w:sz="6" w:color="D9D9D9"/>
@@ -7914,7 +7919,7 @@
         </w:tc>
         <w:tc>
           <w:tcPr>
-            <w:tcW w:type="dxa" w:w="1729"/>
+            <w:tcW w:type="dxa" w:w="2324"/>
             <w:vAlign w:val="center"/>
             <w:tcBorders>
               <w:top w:val="single" w:sz="6" w:color="D9D9D9"/>
@@ -7944,7 +7949,7 @@
         </w:tc>
         <w:tc>
           <w:tcPr>
-            <w:tcW w:type="dxa" w:w="1729"/>
+            <w:tcW w:type="dxa" w:w="2324"/>
             <w:vAlign w:val="center"/>
             <w:tcBorders>
               <w:top w:val="single" w:sz="6" w:color="D9D9D9"/>
@@ -7974,7 +7979,7 @@
         </w:tc>
         <w:tc>
           <w:tcPr>
-            <w:tcW w:type="dxa" w:w="1899"/>
+            <w:tcW w:type="dxa" w:w="2494"/>
             <w:vAlign w:val="center"/>
             <w:tcBorders>
               <w:top w:val="single" w:sz="6" w:color="D9D9D9"/>
@@ -8004,7 +8009,7 @@
         </w:tc>
         <w:tc>
           <w:tcPr>
-            <w:tcW w:type="dxa" w:w="1899"/>
+            <w:tcW w:type="dxa" w:w="2494"/>
             <w:vAlign w:val="center"/>
             <w:tcBorders>
               <w:top w:val="single" w:sz="6" w:color="D9D9D9"/>
@@ -8034,7 +8039,7 @@
         </w:tc>
         <w:tc>
           <w:tcPr>
-            <w:tcW w:type="dxa" w:w="2268"/>
+            <w:tcW w:type="dxa" w:w="2835"/>
             <w:vAlign w:val="center"/>
             <w:tcBorders>
               <w:top w:val="single" w:sz="6" w:color="D9D9D9"/>
@@ -8064,7 +8069,7 @@
         </w:tc>
         <w:tc>
           <w:tcPr>
-            <w:tcW w:type="dxa" w:w="1134"/>
+            <w:tcW w:type="dxa" w:w="794"/>
             <w:vAlign w:val="center"/>
             <w:tcBorders>
               <w:top w:val="single" w:sz="6" w:color="D9D9D9"/>
@@ -8096,7 +8101,7 @@
       <w:tr>
         <w:tc>
           <w:tcPr>
-            <w:tcW w:type="dxa" w:w="567"/>
+            <w:tcW w:type="dxa" w:w="624"/>
             <w:vAlign w:val="center"/>
             <w:tcBorders>
               <w:top w:val="single" w:sz="6" w:color="D9D9D9"/>
@@ -8126,7 +8131,7 @@
         </w:tc>
         <w:tc>
           <w:tcPr>
-            <w:tcW w:type="dxa" w:w="1729"/>
+            <w:tcW w:type="dxa" w:w="2324"/>
             <w:vAlign w:val="center"/>
             <w:tcBorders>
               <w:top w:val="single" w:sz="6" w:color="D9D9D9"/>
@@ -8156,7 +8161,7 @@
         </w:tc>
         <w:tc>
           <w:tcPr>
-            <w:tcW w:type="dxa" w:w="1729"/>
+            <w:tcW w:type="dxa" w:w="2324"/>
             <w:vAlign w:val="center"/>
             <w:tcBorders>
               <w:top w:val="single" w:sz="6" w:color="D9D9D9"/>
@@ -8186,7 +8191,7 @@
         </w:tc>
         <w:tc>
           <w:tcPr>
-            <w:tcW w:type="dxa" w:w="1899"/>
+            <w:tcW w:type="dxa" w:w="2494"/>
             <w:vAlign w:val="center"/>
             <w:tcBorders>
               <w:top w:val="single" w:sz="6" w:color="D9D9D9"/>
@@ -8216,7 +8221,7 @@
         </w:tc>
         <w:tc>
           <w:tcPr>
-            <w:tcW w:type="dxa" w:w="1899"/>
+            <w:tcW w:type="dxa" w:w="2494"/>
             <w:vAlign w:val="center"/>
             <w:tcBorders>
               <w:top w:val="single" w:sz="6" w:color="D9D9D9"/>
@@ -8246,7 +8251,7 @@
         </w:tc>
         <w:tc>
           <w:tcPr>
-            <w:tcW w:type="dxa" w:w="2268"/>
+            <w:tcW w:type="dxa" w:w="2835"/>
             <w:vAlign w:val="center"/>
             <w:tcBorders>
               <w:top w:val="single" w:sz="6" w:color="D9D9D9"/>
@@ -8276,7 +8281,7 @@
         </w:tc>
         <w:tc>
           <w:tcPr>
-            <w:tcW w:type="dxa" w:w="1134"/>
+            <w:tcW w:type="dxa" w:w="794"/>
             <w:vAlign w:val="center"/>
             <w:tcBorders>
               <w:top w:val="single" w:sz="6" w:color="D9D9D9"/>
@@ -8308,7 +8313,7 @@
       <w:tr>
         <w:tc>
           <w:tcPr>
-            <w:tcW w:type="dxa" w:w="567"/>
+            <w:tcW w:type="dxa" w:w="624"/>
             <w:vAlign w:val="center"/>
             <w:tcBorders>
               <w:top w:val="single" w:sz="6" w:color="D9D9D9"/>
@@ -8338,7 +8343,7 @@
         </w:tc>
         <w:tc>
           <w:tcPr>
-            <w:tcW w:type="dxa" w:w="1729"/>
+            <w:tcW w:type="dxa" w:w="2324"/>
             <w:vAlign w:val="center"/>
             <w:tcBorders>
               <w:top w:val="single" w:sz="6" w:color="D9D9D9"/>
@@ -8368,7 +8373,7 @@
         </w:tc>
         <w:tc>
           <w:tcPr>
-            <w:tcW w:type="dxa" w:w="1729"/>
+            <w:tcW w:type="dxa" w:w="2324"/>
             <w:vAlign w:val="center"/>
             <w:tcBorders>
               <w:top w:val="single" w:sz="6" w:color="D9D9D9"/>
@@ -8398,7 +8403,7 @@
         </w:tc>
         <w:tc>
           <w:tcPr>
-            <w:tcW w:type="dxa" w:w="1899"/>
+            <w:tcW w:type="dxa" w:w="2494"/>
             <w:vAlign w:val="center"/>
             <w:tcBorders>
               <w:top w:val="single" w:sz="6" w:color="D9D9D9"/>
@@ -8428,7 +8433,7 @@
         </w:tc>
         <w:tc>
           <w:tcPr>
-            <w:tcW w:type="dxa" w:w="1899"/>
+            <w:tcW w:type="dxa" w:w="2494"/>
             <w:vAlign w:val="center"/>
             <w:tcBorders>
               <w:top w:val="single" w:sz="6" w:color="D9D9D9"/>
@@ -8458,7 +8463,7 @@
         </w:tc>
         <w:tc>
           <w:tcPr>
-            <w:tcW w:type="dxa" w:w="2268"/>
+            <w:tcW w:type="dxa" w:w="2835"/>
             <w:vAlign w:val="center"/>
             <w:tcBorders>
               <w:top w:val="single" w:sz="6" w:color="D9D9D9"/>
@@ -8488,7 +8493,7 @@
         </w:tc>
         <w:tc>
           <w:tcPr>
-            <w:tcW w:type="dxa" w:w="1134"/>
+            <w:tcW w:type="dxa" w:w="794"/>
             <w:vAlign w:val="center"/>
             <w:tcBorders>
               <w:top w:val="single" w:sz="6" w:color="D9D9D9"/>
@@ -8520,7 +8525,7 @@
       <w:tr>
         <w:tc>
           <w:tcPr>
-            <w:tcW w:type="dxa" w:w="567"/>
+            <w:tcW w:type="dxa" w:w="624"/>
             <w:vAlign w:val="center"/>
             <w:tcBorders>
               <w:top w:val="single" w:sz="6" w:color="D9D9D9"/>
@@ -8550,7 +8555,7 @@
         </w:tc>
         <w:tc>
           <w:tcPr>
-            <w:tcW w:type="dxa" w:w="1729"/>
+            <w:tcW w:type="dxa" w:w="2324"/>
             <w:vAlign w:val="center"/>
             <w:tcBorders>
               <w:top w:val="single" w:sz="6" w:color="D9D9D9"/>
@@ -8580,7 +8585,7 @@
         </w:tc>
         <w:tc>
           <w:tcPr>
-            <w:tcW w:type="dxa" w:w="1729"/>
+            <w:tcW w:type="dxa" w:w="2324"/>
             <w:vAlign w:val="center"/>
             <w:tcBorders>
               <w:top w:val="single" w:sz="6" w:color="D9D9D9"/>
@@ -8610,7 +8615,7 @@
         </w:tc>
         <w:tc>
           <w:tcPr>
-            <w:tcW w:type="dxa" w:w="1899"/>
+            <w:tcW w:type="dxa" w:w="2494"/>
             <w:vAlign w:val="center"/>
             <w:tcBorders>
               <w:top w:val="single" w:sz="6" w:color="D9D9D9"/>
@@ -8640,7 +8645,7 @@
         </w:tc>
         <w:tc>
           <w:tcPr>
-            <w:tcW w:type="dxa" w:w="1899"/>
+            <w:tcW w:type="dxa" w:w="2494"/>
             <w:vAlign w:val="center"/>
             <w:tcBorders>
               <w:top w:val="single" w:sz="6" w:color="D9D9D9"/>
@@ -8670,7 +8675,7 @@
         </w:tc>
         <w:tc>
           <w:tcPr>
-            <w:tcW w:type="dxa" w:w="2268"/>
+            <w:tcW w:type="dxa" w:w="2835"/>
             <w:vAlign w:val="center"/>
             <w:tcBorders>
               <w:top w:val="single" w:sz="6" w:color="D9D9D9"/>
@@ -8700,7 +8705,7 @@
         </w:tc>
         <w:tc>
           <w:tcPr>
-            <w:tcW w:type="dxa" w:w="1134"/>
+            <w:tcW w:type="dxa" w:w="794"/>
             <w:vAlign w:val="center"/>
             <w:tcBorders>
               <w:top w:val="single" w:sz="6" w:color="D9D9D9"/>
@@ -8732,7 +8737,7 @@
       <w:tr>
         <w:tc>
           <w:tcPr>
-            <w:tcW w:type="dxa" w:w="567"/>
+            <w:tcW w:type="dxa" w:w="624"/>
             <w:vAlign w:val="center"/>
             <w:tcBorders>
               <w:top w:val="single" w:sz="6" w:color="D9D9D9"/>
@@ -8762,7 +8767,7 @@
         </w:tc>
         <w:tc>
           <w:tcPr>
-            <w:tcW w:type="dxa" w:w="1729"/>
+            <w:tcW w:type="dxa" w:w="2324"/>
             <w:vAlign w:val="center"/>
             <w:tcBorders>
               <w:top w:val="single" w:sz="6" w:color="D9D9D9"/>
@@ -8792,7 +8797,7 @@
         </w:tc>
         <w:tc>
           <w:tcPr>
-            <w:tcW w:type="dxa" w:w="1729"/>
+            <w:tcW w:type="dxa" w:w="2324"/>
             <w:vAlign w:val="center"/>
             <w:tcBorders>
               <w:top w:val="single" w:sz="6" w:color="D9D9D9"/>
@@ -8822,7 +8827,7 @@
         </w:tc>
         <w:tc>
           <w:tcPr>
-            <w:tcW w:type="dxa" w:w="1899"/>
+            <w:tcW w:type="dxa" w:w="2494"/>
             <w:vAlign w:val="center"/>
             <w:tcBorders>
               <w:top w:val="single" w:sz="6" w:color="D9D9D9"/>
@@ -8852,7 +8857,7 @@
         </w:tc>
         <w:tc>
           <w:tcPr>
-            <w:tcW w:type="dxa" w:w="1899"/>
+            <w:tcW w:type="dxa" w:w="2494"/>
             <w:vAlign w:val="center"/>
             <w:tcBorders>
               <w:top w:val="single" w:sz="6" w:color="D9D9D9"/>
@@ -8882,7 +8887,7 @@
         </w:tc>
         <w:tc>
           <w:tcPr>
-            <w:tcW w:type="dxa" w:w="2268"/>
+            <w:tcW w:type="dxa" w:w="2835"/>
             <w:vAlign w:val="center"/>
             <w:tcBorders>
               <w:top w:val="single" w:sz="6" w:color="D9D9D9"/>
@@ -8912,7 +8917,7 @@
         </w:tc>
         <w:tc>
           <w:tcPr>
-            <w:tcW w:type="dxa" w:w="1134"/>
+            <w:tcW w:type="dxa" w:w="794"/>
             <w:vAlign w:val="center"/>
             <w:tcBorders>
               <w:top w:val="single" w:sz="6" w:color="D9D9D9"/>

</xml_diff>

<commit_message>
fix(docs): clone reference covers for 04-06
</commit_message>
<xml_diff>
--- a/docs/deliverables/04-风险登记册v1.docx
+++ b/docs/deliverables/04-风险登记册v1.docx
@@ -2,183 +2,341 @@
 <file path=word/document.xml><?xml version="1.0" encoding="utf-8"?>
 <ns0:document xmlns:ns0="http://schemas.openxmlformats.org/wordprocessingml/2006/main" xmlns:ns1="http://schemas.openxmlformats.org/markup-compatibility/2006" xmlns:ns2="http://schemas.openxmlformats.org/drawingml/2006/wordprocessingDrawing" xmlns:ns3="http://schemas.openxmlformats.org/drawingml/2006/main" xmlns:ns4="http://schemas.openxmlformats.org/drawingml/2006/picture" xmlns:ns5="http://schemas.openxmlformats.org/officeDocument/2006/relationships" ns1:Ignorable="w14 w15 w16se w16cid w16 w16cex w16sdtdh wp14">
   <ns0:body>
-    <ns0:p>
+    <ns0:p xmlns:w14="http://schemas.microsoft.com/office/word/2010/wordml" ns0:rsidR="004979D7" ns0:rsidRDefault="00692DA2">
       <ns0:pPr>
-        <ns0:spacing ns0:before="0" ns0:after="60" ns0:line="300" ns0:lineRule="auto"/>
-        <ns0:jc ns0:val="right"/>
-      </ns0:pPr>
-      <ns0:r>
-        <ns0:t>文档编号：【待人工确认】　　版本号：V1.3</ns0:t>
-      </ns0:r>
-    </ns0:p>
-    <ns0:p>
-      <ns0:pPr>
-        <ns0:spacing ns0:before="0" ns0:after="900" ns0:line="300" ns0:lineRule="auto"/>
+        <ns0:spacing ns0:after="80"/>
         <ns0:jc ns0:val="right"/>
       </ns0:pPr>
       <ns0:r>
         <ns0:rPr>
-          <ns0:rFonts ns0:ascii="宋体" ns0:hAnsi="宋体" ns0:eastAsia="宋体"/>
-          <ns0:b ns0:val="0"/>
+          <ns0:rFonts ns0:eastAsia="宋体"/>
+          <ns0:color ns0:val="000000"/>
+          <ns0:sz ns0:val="24"/>
+        </ns0:rPr>
+        <ns0:t>文档编号：【待人工确认】　　版本号：V1.3</ns0:t>
+      </ns0:r>
+      <ns0:r>
+        <ns0:rPr>
+          <ns0:rFonts ns0:eastAsia="宋体"/>
+          <ns0:color ns0:val="000000"/>
+          <ns0:sz ns0:val="24"/>
+        </ns0:rPr>
+        <ns0:t/>
+      </ns0:r>
+      <ns0:r>
+        <ns0:rPr>
+          <ns0:rFonts ns0:eastAsia="宋体"/>
+          <ns0:color ns0:val="000000"/>
+          <ns0:sz ns0:val="24"/>
+        </ns0:rPr>
+        <ns0:t xml:space="preserve"/>
+      </ns0:r>
+      <ns0:r>
+        <ns0:rPr>
+          <ns0:rFonts ns0:eastAsia="宋体"/>
+          <ns0:color ns0:val="000000"/>
+          <ns0:sz ns0:val="24"/>
+        </ns0:rPr>
+        <ns0:t/>
+      </ns0:r>
+    </ns0:p>
+    <ns0:p xmlns:w14="http://schemas.microsoft.com/office/word/2010/wordml" ns0:rsidR="004979D7" ns0:rsidRDefault="00692DA2">
+      <ns0:pPr>
+        <ns0:spacing ns0:before="1200" ns0:after="360"/>
+        <ns0:jc ns0:val="right"/>
+      </ns0:pPr>
+      <ns0:r>
+        <ns0:rPr>
+          <ns0:rFonts ns0:eastAsia="宋体"/>
           <ns0:color ns0:val="000000"/>
           <ns0:sz ns0:val="24"/>
         </ns0:rPr>
         <ns0:t>密　　级：内部</ns0:t>
       </ns0:r>
+      <ns0:r>
+        <ns0:rPr>
+          <ns0:rFonts ns0:eastAsia="宋体"/>
+          <ns0:color ns0:val="000000"/>
+          <ns0:sz ns0:val="24"/>
+        </ns0:rPr>
+        <ns0:t xml:space="preserve"/>
+      </ns0:r>
+      <ns0:r>
+        <ns0:rPr>
+          <ns0:rFonts ns0:eastAsia="宋体"/>
+          <ns0:color ns0:val="000000"/>
+          <ns0:sz ns0:val="24"/>
+        </ns0:rPr>
+        <ns0:t/>
+      </ns0:r>
     </ns0:p>
-    <ns0:p>
+    <ns0:p xmlns:w14="http://schemas.microsoft.com/office/word/2010/wordml" ns0:rsidR="004979D7" ns0:rsidRDefault="004979D7">
       <ns0:pPr>
-        <ns0:spacing ns0:before="0" ns0:after="200" ns0:line="300" ns0:lineRule="auto"/>
+        <ns0:spacing ns0:before="2000" ns0:after="480"/>
+        <ns0:jc ns0:val="center"/>
+      </ns0:pPr>
+    </ns0:p>
+    <ns0:p xmlns:w14="http://schemas.microsoft.com/office/word/2010/wordml" ns0:rsidR="004979D7" ns0:rsidRDefault="00692DA2">
+      <ns0:pPr>
+        <ns0:pBdr>
+          <ns0:bottom ns0:val="single" ns0:sz="12" ns0:space="8" ns0:color="000000"/>
+        </ns0:pBdr>
+        <ns0:spacing ns0:before="240" ns0:after="360"/>
         <ns0:jc ns0:val="center"/>
       </ns0:pPr>
       <ns0:r>
         <ns0:rPr>
-          <ns0:rFonts ns0:ascii="黑体" ns0:hAnsi="黑体" ns0:eastAsia="黑体"/>
+          <ns0:rFonts ns0:eastAsia="黑体"/>
           <ns0:b/>
           <ns0:color ns0:val="000000"/>
           <ns0:sz ns0:val="44"/>
         </ns0:rPr>
-        <ns0:t>某自然博物馆智能运营中心建设项目</ns0:t>
+        <ns0:t>某自然博物馆智能运营中心建设项目
+应急管理子系统</ns0:t>
+      </ns0:r>
+      <ns0:r>
+        <ns0:rPr>
+          <ns0:rFonts ns0:eastAsia="黑体"/>
+          <ns0:b/>
+          <ns0:color ns0:val="000000"/>
+          <ns0:sz ns0:val="44"/>
+        </ns0:rPr>
+        <ns0:t/>
+      </ns0:r>
+      <ns0:r>
+        <ns0:rPr>
+          <ns0:rFonts ns0:eastAsia="黑体"/>
+          <ns0:b/>
+          <ns0:color ns0:val="000000"/>
+          <ns0:sz ns0:val="44"/>
+        </ns0:rPr>
+        <ns0:t/>
+      </ns0:r>
+      <ns0:r>
+        <ns0:rPr>
+          <ns0:rFonts ns0:eastAsia="黑体"/>
+          <ns0:b/>
+          <ns0:color ns0:val="000000"/>
+          <ns0:sz ns0:val="44"/>
+        </ns0:rPr>
+        <ns0:t/>
       </ns0:r>
     </ns0:p>
-    <ns0:p>
+    <ns0:p xmlns:w14="http://schemas.microsoft.com/office/word/2010/wordml" ns0:rsidR="004979D7" ns0:rsidRDefault="00692DA2">
       <ns0:pPr>
-        <ns0:spacing ns0:before="0" ns0:after="360" ns0:line="300" ns0:lineRule="auto"/>
+        <ns0:spacing ns0:before="520" ns0:after="200"/>
         <ns0:jc ns0:val="center"/>
       </ns0:pPr>
       <ns0:r>
         <ns0:rPr>
-          <ns0:rFonts ns0:ascii="黑体" ns0:hAnsi="黑体" ns0:eastAsia="黑体"/>
-          <ns0:b/>
-          <ns0:color ns0:val="000000"/>
-          <ns0:sz ns0:val="44"/>
-        </ns0:rPr>
-        <ns0:t>应急管理子系统</ns0:t>
-      </ns0:r>
-    </ns0:p>
-    <ns0:p>
-      <ns0:pPr>
-        <ns0:spacing ns0:before="0" ns0:after="1040" ns0:line="300" ns0:lineRule="auto"/>
-        <ns0:jc ns0:val="center"/>
-      </ns0:pPr>
-      <ns0:r>
-        <ns0:rPr>
-          <ns0:rFonts ns0:ascii="黑体" ns0:hAnsi="黑体" ns0:eastAsia="黑体"/>
+          <ns0:rFonts ns0:eastAsia="黑体"/>
           <ns0:b/>
           <ns0:color ns0:val="000000"/>
           <ns0:sz ns0:val="56"/>
         </ns0:rPr>
         <ns0:t>风险登记册（v1）</ns0:t>
       </ns0:r>
+      <ns0:r>
+        <ns0:rPr>
+          <ns0:rFonts ns0:eastAsia="黑体"/>
+          <ns0:b/>
+          <ns0:color ns0:val="000000"/>
+          <ns0:sz ns0:val="56"/>
+        </ns0:rPr>
+        <ns0:t/>
+      </ns0:r>
+      <ns0:r>
+        <ns0:rPr>
+          <ns0:rFonts ns0:eastAsia="黑体"/>
+          <ns0:b/>
+          <ns0:color ns0:val="000000"/>
+          <ns0:sz ns0:val="56"/>
+        </ns0:rPr>
+        <ns0:t/>
+      </ns0:r>
     </ns0:p>
-    <ns0:p>
+    <ns0:p xmlns:w14="http://schemas.microsoft.com/office/word/2010/wordml" ns0:rsidR="004979D7" ns0:rsidRDefault="00692DA2">
       <ns0:pPr>
-        <ns0:spacing ns0:before="0" ns0:after="200" ns0:line="300" ns0:lineRule="auto"/>
+        <ns0:spacing ns0:after="80"/>
+        <ns0:jc ns0:val="center"/>
+      </ns0:pPr>
+      <ns0:r>
+        <ns0:rPr>
+          <ns0:rFonts ns0:eastAsia="楷体"/>
+          <ns0:color ns0:val="000000"/>
+          <ns0:sz ns0:val="28"/>
+        </ns0:rPr>
+        <ns0:t/>
+      </ns0:r>
+    </ns0:p>
+    <ns0:p xmlns:w14="http://schemas.microsoft.com/office/word/2010/wordml" ns0:rsidR="004979D7" ns0:rsidRDefault="004979D7" ns0:rsidP="008D06D0">
+      <ns0:pPr>
+        <ns0:spacing ns0:before="1600" ns0:after="80"/>
+        <ns0:ind ns0:leftChars="1205" ns0:left="2410"/>
+        <ns0:jc ns0:val="left"/>
+      </ns0:pPr>
+    </ns0:p>
+    <ns0:p xmlns:w14="http://schemas.microsoft.com/office/word/2010/wordml" ns0:rsidR="004979D7" ns0:rsidRDefault="00692DA2" ns0:rsidP="008D06D0">
+      <ns0:pPr>
+        <ns0:spacing ns0:after="200"/>
+        <ns0:ind ns0:leftChars="1205" ns0:left="2410"/>
         <ns0:jc ns0:val="left"/>
       </ns0:pPr>
       <ns0:r>
         <ns0:rPr>
-          <ns0:rFonts ns0:ascii="仿宋" ns0:hAnsi="仿宋" ns0:eastAsia="仿宋"/>
-          <ns0:b ns0:val="0"/>
+          <ns0:rFonts ns0:eastAsia="仿宋"/>
           <ns0:color ns0:val="000000"/>
           <ns0:sz ns0:val="32"/>
         </ns0:rPr>
         <ns0:t>编制单位：项目组</ns0:t>
       </ns0:r>
+      <ns0:r>
+        <ns0:rPr>
+          <ns0:rFonts ns0:eastAsia="仿宋"/>
+          <ns0:color ns0:val="000000"/>
+          <ns0:sz ns0:val="32"/>
+        </ns0:rPr>
+        <ns0:t xml:space="preserve"/>
+      </ns0:r>
+      <ns0:r>
+        <ns0:rPr>
+          <ns0:rFonts ns0:eastAsia="仿宋"/>
+          <ns0:color ns0:val="000000"/>
+          <ns0:sz ns0:val="32"/>
+        </ns0:rPr>
+        <ns0:t/>
+      </ns0:r>
     </ns0:p>
-    <ns0:p>
+    <ns0:p xmlns:w14="http://schemas.microsoft.com/office/word/2010/wordml" ns0:rsidR="004979D7" ns0:rsidRDefault="00692DA2" ns0:rsidP="008D06D0">
       <ns0:pPr>
-        <ns0:spacing ns0:before="0" ns0:after="200" ns0:line="300" ns0:lineRule="auto"/>
+        <ns0:spacing ns0:after="200"/>
+        <ns0:ind ns0:leftChars="1205" ns0:left="2410"/>
         <ns0:jc ns0:val="left"/>
       </ns0:pPr>
       <ns0:r>
         <ns0:rPr>
-          <ns0:rFonts ns0:ascii="仿宋" ns0:hAnsi="仿宋" ns0:eastAsia="仿宋"/>
-          <ns0:b ns0:val="0"/>
+          <ns0:rFonts ns0:eastAsia="仿宋"/>
           <ns0:color ns0:val="000000"/>
           <ns0:sz ns0:val="32"/>
         </ns0:rPr>
         <ns0:t>编　　制：何思源（项目经理 PM / 总编）</ns0:t>
       </ns0:r>
     </ns0:p>
-    <ns0:p>
+    <ns0:p xmlns:w14="http://schemas.microsoft.com/office/word/2010/wordml" ns0:rsidR="004979D7" ns0:rsidRDefault="00692DA2" ns0:rsidP="008D06D0">
       <ns0:pPr>
-        <ns0:spacing ns0:before="0" ns0:after="200" ns0:line="300" ns0:lineRule="auto"/>
+        <ns0:spacing ns0:after="200"/>
+        <ns0:ind ns0:leftChars="1205" ns0:left="2410"/>
         <ns0:jc ns0:val="left"/>
       </ns0:pPr>
       <ns0:r>
         <ns0:rPr>
-          <ns0:rFonts ns0:ascii="仿宋" ns0:hAnsi="仿宋" ns0:eastAsia="仿宋"/>
-          <ns0:b ns0:val="0"/>
+          <ns0:rFonts ns0:eastAsia="仿宋"/>
           <ns0:color ns0:val="000000"/>
           <ns0:sz ns0:val="32"/>
         </ns0:rPr>
         <ns0:t>审　　核：任俊强（计划完整性与一致性复核）</ns0:t>
       </ns0:r>
     </ns0:p>
-    <ns0:p>
+    <ns0:p xmlns:w14="http://schemas.microsoft.com/office/word/2010/wordml" ns0:rsidR="004979D7" ns0:rsidRDefault="00692DA2" ns0:rsidP="008D06D0">
       <ns0:pPr>
-        <ns0:spacing ns0:before="0" ns0:after="200" ns0:line="300" ns0:lineRule="auto"/>
+        <ns0:spacing ns0:after="200"/>
+        <ns0:ind ns0:leftChars="1205" ns0:left="2410"/>
         <ns0:jc ns0:val="left"/>
       </ns0:pPr>
       <ns0:r>
         <ns0:rPr>
-          <ns0:rFonts ns0:ascii="仿宋" ns0:hAnsi="仿宋" ns0:eastAsia="仿宋"/>
-          <ns0:b ns0:val="0"/>
+          <ns0:rFonts ns0:eastAsia="仿宋"/>
           <ns0:color ns0:val="000000"/>
           <ns0:sz ns0:val="32"/>
         </ns0:rPr>
         <ns0:t>批　　准：【待人工确认】</ns0:t>
       </ns0:r>
+      <ns0:r>
+        <ns0:rPr>
+          <ns0:rFonts ns0:eastAsia="仿宋"/>
+          <ns0:color ns0:val="000000"/>
+          <ns0:sz ns0:val="32"/>
+        </ns0:rPr>
+        <ns0:t/>
+      </ns0:r>
+      <ns0:r>
+        <ns0:rPr>
+          <ns0:rFonts ns0:eastAsia="仿宋"/>
+          <ns0:color ns0:val="000000"/>
+          <ns0:sz ns0:val="32"/>
+        </ns0:rPr>
+        <ns0:t/>
+      </ns0:r>
     </ns0:p>
-    <ns0:p>
+    <ns0:p xmlns:w14="http://schemas.microsoft.com/office/word/2010/wordml" ns0:rsidR="004979D7" ns0:rsidRDefault="00692DA2" ns0:rsidP="008D06D0">
       <ns0:pPr>
-        <ns0:spacing ns0:before="0" ns0:after="0" ns0:line="300" ns0:lineRule="auto"/>
+        <ns0:spacing ns0:before="200" ns0:after="80"/>
+        <ns0:ind ns0:leftChars="1205" ns0:left="2410"/>
         <ns0:jc ns0:val="left"/>
       </ns0:pPr>
       <ns0:r>
         <ns0:rPr>
-          <ns0:rFonts ns0:ascii="仿宋" ns0:hAnsi="仿宋" ns0:eastAsia="仿宋"/>
-          <ns0:b ns0:val="0"/>
+          <ns0:rFonts ns0:eastAsia="仿宋"/>
           <ns0:color ns0:val="000000"/>
           <ns0:sz ns0:val="32"/>
         </ns0:rPr>
         <ns0:t>编制日期：2026 年 9 月 11 日</ns0:t>
       </ns0:r>
-    </ns0:p>
-    <ns0:p>
       <ns0:r>
-        <ns0:br ns0:type="page"/>
+        <ns0:rPr>
+          <ns0:rFonts ns0:eastAsia="仿宋"/>
+          <ns0:color ns0:val="000000"/>
+          <ns0:sz ns0:val="32"/>
+        </ns0:rPr>
+        <ns0:t xml:space="preserve"/>
+      </ns0:r>
+      <ns0:r>
+        <ns0:rPr>
+          <ns0:rFonts ns0:eastAsia="仿宋"/>
+          <ns0:color ns0:val="000000"/>
+          <ns0:sz ns0:val="32"/>
+        </ns0:rPr>
+        <ns0:t/>
+      </ns0:r>
+      <ns0:r>
+        <ns0:rPr>
+          <ns0:rFonts ns0:eastAsia="仿宋"/>
+          <ns0:color ns0:val="000000"/>
+          <ns0:sz ns0:val="32"/>
+        </ns0:rPr>
+        <ns0:t xml:space="preserve"/>
+      </ns0:r>
+      <ns0:r>
+        <ns0:rPr>
+          <ns0:rFonts ns0:eastAsia="仿宋"/>
+          <ns0:color ns0:val="000000"/>
+          <ns0:sz ns0:val="32"/>
+        </ns0:rPr>
+        <ns0:t/>
+      </ns0:r>
+      <ns0:r>
+        <ns0:rPr>
+          <ns0:rFonts ns0:eastAsia="仿宋"/>
+          <ns0:color ns0:val="000000"/>
+          <ns0:sz ns0:val="32"/>
+        </ns0:rPr>
+        <ns0:t xml:space="preserve"/>
+      </ns0:r>
+      <ns0:r>
+        <ns0:rPr>
+          <ns0:rFonts ns0:eastAsia="仿宋"/>
+          <ns0:color ns0:val="000000"/>
+          <ns0:sz ns0:val="32"/>
+        </ns0:rPr>
+        <ns0:t/>
       </ns0:r>
     </ns0:p>
-    <ns0:p>
-      <ns0:pPr>
-        <ns0:spacing ns0:before="0" ns0:after="80" ns0:line="300" ns0:lineRule="auto"/>
-        <ns0:jc ns0:val="center"/>
-      </ns0:pPr>
+    <ns0:p xmlns:w14="http://schemas.microsoft.com/office/word/2010/wordml" ns0:rsidR="004979D7" ns0:rsidRDefault="00692DA2">
       <ns0:r>
         <ns0:rPr>
-          <ns0:rFonts ns0:ascii="黑体" ns0:hAnsi="黑体" ns0:eastAsia="黑体"/>
-          <ns0:b/>
           <ns0:color ns0:val="000000"/>
-          <ns0:sz ns0:val="24"/>
         </ns0:rPr>
-        <ns0:t>修订记录</ns0:t>
-      </ns0:r>
-    </ns0:p>
-    <ns0:p>
-      <ns0:pPr>
-        <ns0:spacing ns0:before="0" ns0:after="100" ns0:line="240" ns0:lineRule="auto"/>
-        <ns0:jc ns0:val="left"/>
-      </ns0:pPr>
-      <ns0:r>
-        <ns0:rPr>
-          <ns0:rFonts ns0:ascii="宋体" ns0:hAnsi="宋体" ns0:eastAsia="宋体"/>
-          <ns0:b ns0:val="0"/>
-          <ns0:color ns0:val="000000"/>
-          <ns0:sz ns0:val="18"/>
-        </ns0:rPr>
-        <ns0:t>注：本表记录自初稿以来的全部版本沿革；风险状态、措施和关联证据的后续变化在本登记册版本中保留。</ns0:t>
+        <ns0:br ns0:type="page"/>
       </ns0:r>
     </ns0:p>
     <ns0:tbl>

</xml_diff>

<commit_message>
fix(docs): preserve 04 post-cover XML
</commit_message>
<xml_diff>
--- a/docs/deliverables/04-风险登记册v1.docx
+++ b/docs/deliverables/04-风险登记册v1.docx
@@ -13,7 +13,8 @@
           <ns0:color ns0:val="000000"/>
           <ns0:sz ns0:val="24"/>
         </ns0:rPr>
-        <ns0:t>文档编号：【待人工确认】　　版本号：V1.3</ns0:t>
+        <ns0:t>文件编号：【待人工确认】
+版本号：V1.3</ns0:t>
       </ns0:r>
       <ns0:r>
         <ns0:rPr>
@@ -51,7 +52,7 @@
           <ns0:color ns0:val="000000"/>
           <ns0:sz ns0:val="24"/>
         </ns0:rPr>
-        <ns0:t>密　　级：内部</ns0:t>
+        <ns0:t>密级：内部</ns0:t>
       </ns0:r>
       <ns0:r>
         <ns0:rPr>
@@ -70,18 +71,12 @@
         <ns0:t/>
       </ns0:r>
     </ns0:p>
-    <ns0:p xmlns:w14="http://schemas.microsoft.com/office/word/2010/wordml" ns0:rsidR="004979D7" ns0:rsidRDefault="004979D7">
-      <ns0:pPr>
-        <ns0:spacing ns0:before="2000" ns0:after="480"/>
-        <ns0:jc ns0:val="center"/>
-      </ns0:pPr>
-    </ns0:p>
     <ns0:p xmlns:w14="http://schemas.microsoft.com/office/word/2010/wordml" ns0:rsidR="004979D7" ns0:rsidRDefault="00692DA2">
       <ns0:pPr>
         <ns0:pBdr>
           <ns0:bottom ns0:val="single" ns0:sz="12" ns0:space="8" ns0:color="000000"/>
         </ns0:pBdr>
-        <ns0:spacing ns0:before="240" ns0:after="360"/>
+        <ns0:spacing ns0:before="2600" ns0:after="360"/>
         <ns0:jc ns0:val="center"/>
       </ns0:pPr>
       <ns0:r>
@@ -157,7 +152,7 @@
     </ns0:p>
     <ns0:p xmlns:w14="http://schemas.microsoft.com/office/word/2010/wordml" ns0:rsidR="004979D7" ns0:rsidRDefault="00692DA2">
       <ns0:pPr>
-        <ns0:spacing ns0:after="80"/>
+        <ns0:spacing ns0:after="2300"/>
         <ns0:jc ns0:val="center"/>
       </ns0:pPr>
       <ns0:r>
@@ -168,13 +163,6 @@
         </ns0:rPr>
         <ns0:t/>
       </ns0:r>
-    </ns0:p>
-    <ns0:p xmlns:w14="http://schemas.microsoft.com/office/word/2010/wordml" ns0:rsidR="004979D7" ns0:rsidRDefault="004979D7" ns0:rsidP="008D06D0">
-      <ns0:pPr>
-        <ns0:spacing ns0:before="1600" ns0:after="80"/>
-        <ns0:ind ns0:leftChars="1205" ns0:left="2410"/>
-        <ns0:jc ns0:val="left"/>
-      </ns0:pPr>
     </ns0:p>
     <ns0:p xmlns:w14="http://schemas.microsoft.com/office/word/2010/wordml" ns0:rsidR="004979D7" ns0:rsidRDefault="00692DA2" ns0:rsidP="008D06D0">
       <ns0:pPr>
@@ -219,7 +207,7 @@
           <ns0:color ns0:val="000000"/>
           <ns0:sz ns0:val="32"/>
         </ns0:rPr>
-        <ns0:t>编　　制：何思源（项目经理 PM / 总编）</ns0:t>
+        <ns0:t>编制：何思源（项目经理 PM / 总编）</ns0:t>
       </ns0:r>
     </ns0:p>
     <ns0:p xmlns:w14="http://schemas.microsoft.com/office/word/2010/wordml" ns0:rsidR="004979D7" ns0:rsidRDefault="00692DA2" ns0:rsidP="008D06D0">
@@ -234,7 +222,7 @@
           <ns0:color ns0:val="000000"/>
           <ns0:sz ns0:val="32"/>
         </ns0:rPr>
-        <ns0:t>审　　核：任俊强（计划完整性与一致性复核）</ns0:t>
+        <ns0:t>审核：任俊强（计划完整性与一致性复核）</ns0:t>
       </ns0:r>
     </ns0:p>
     <ns0:p xmlns:w14="http://schemas.microsoft.com/office/word/2010/wordml" ns0:rsidR="004979D7" ns0:rsidRDefault="00692DA2" ns0:rsidP="008D06D0">
@@ -249,7 +237,7 @@
           <ns0:color ns0:val="000000"/>
           <ns0:sz ns0:val="32"/>
         </ns0:rPr>
-        <ns0:t>批　　准：【待人工确认】</ns0:t>
+        <ns0:t>批准：【待人工确认】</ns0:t>
       </ns0:r>
       <ns0:r>
         <ns0:rPr>
@@ -331,12 +319,39 @@
         <ns0:t/>
       </ns0:r>
     </ns0:p>
-    <ns0:p xmlns:w14="http://schemas.microsoft.com/office/word/2010/wordml" ns0:rsidR="004979D7" ns0:rsidRDefault="00692DA2">
+    <ns0:p>
+      <ns0:r>
+        <ns0:br ns0:type="page"/>
+      </ns0:r>
+    </ns0:p>
+    <ns0:p>
+      <ns0:pPr>
+        <ns0:spacing ns0:before="0" ns0:after="80" ns0:line="300" ns0:lineRule="auto"/>
+        <ns0:jc ns0:val="center"/>
+      </ns0:pPr>
       <ns0:r>
         <ns0:rPr>
+          <ns0:rFonts ns0:ascii="黑体" ns0:hAnsi="黑体" ns0:eastAsia="黑体"/>
+          <ns0:b/>
           <ns0:color ns0:val="000000"/>
+          <ns0:sz ns0:val="24"/>
         </ns0:rPr>
-        <ns0:br ns0:type="page"/>
+        <ns0:t>修订记录</ns0:t>
+      </ns0:r>
+    </ns0:p>
+    <ns0:p>
+      <ns0:pPr>
+        <ns0:spacing ns0:before="0" ns0:after="100" ns0:line="240" ns0:lineRule="auto"/>
+        <ns0:jc ns0:val="left"/>
+      </ns0:pPr>
+      <ns0:r>
+        <ns0:rPr>
+          <ns0:rFonts ns0:ascii="宋体" ns0:hAnsi="宋体" ns0:eastAsia="宋体"/>
+          <ns0:b ns0:val="0"/>
+          <ns0:color ns0:val="000000"/>
+          <ns0:sz ns0:val="18"/>
+        </ns0:rPr>
+        <ns0:t>注：本表记录自初稿以来的全部版本沿革；风险状态、措施和关联证据的后续变化在本登记册版本中保留。</ns0:t>
       </ns0:r>
     </ns0:p>
     <ns0:tbl>

</xml_diff>